<commit_message>
Update UMBL repository with latest materials
</commit_message>
<xml_diff>
--- a/sections_md/Q&A.docx
+++ b/sections_md/Q&A.docx
@@ -66,11 +66,11 @@
       <w:pPr>
         <w:numPr>
           <w:ilvl w:val="0"/>
-          <w:numId w:val="0"/>
+          <w:numId w:val="2"/>
         </w:numPr>
         <w:bidi w:val="0"/>
         <w:spacing w:after="156" w:afterAutospacing="0"/>
-        <w:ind w:leftChars="0"/>
+        <w:ind w:left="425" w:leftChars="0" w:hanging="425" w:firstLineChars="0"/>
         <w:jc w:val="center"/>
         <w:rPr>
           <w:rFonts w:hint="default" w:ascii="Calibri" w:hAnsi="Calibri" w:eastAsia="宋体" w:cs="Calibri"/>
@@ -79,17 +79,6 @@
           <w:lang w:val="en-US" w:eastAsia="zh-CN"/>
         </w:rPr>
       </w:pPr>
-      <w:r>
-        <w:rPr>
-          <w:rFonts w:hint="eastAsia" w:ascii="Calibri" w:hAnsi="Calibri" w:eastAsia="宋体" w:cs="Calibri"/>
-          <w:b/>
-          <w:bCs/>
-          <w:sz w:val="24"/>
-          <w:szCs w:val="24"/>
-          <w:lang w:val="en-US" w:eastAsia="zh-CN"/>
-        </w:rPr>
-        <w:t>1.</w:t>
-      </w:r>
     </w:p>
     <w:p>
       <w:pPr>
@@ -325,7 +314,6 @@
           <w:rFonts w:hint="default" w:ascii="Calibri" w:hAnsi="Calibri" w:cs="Calibri"/>
           <w:sz w:val="24"/>
           <w:szCs w:val="24"/>
-          <w:lang w:val="en-US" w:eastAsia="zh-CN"/>
         </w:rPr>
       </w:pPr>
       <w:r>
@@ -339,36 +327,28 @@
         </w:rPr>
         <w:t>————————————————————————————————</w:t>
       </w:r>
-      <w:r>
-        <w:rPr>
-          <w:rFonts w:hint="default" w:ascii="Calibri" w:hAnsi="Calibri" w:cs="Calibri"/>
-          <w:sz w:val="24"/>
-          <w:szCs w:val="24"/>
-        </w:rPr>
-        <w:br w:type="textWrapping"/>
-      </w:r>
-      <w:r>
-        <w:rPr>
-          <w:rFonts w:hint="eastAsia" w:ascii="Calibri" w:hAnsi="Calibri" w:cs="Calibri"/>
-          <w:b/>
-          <w:bCs/>
-          <w:sz w:val="24"/>
-          <w:szCs w:val="24"/>
-          <w:lang w:val="en-US" w:eastAsia="zh-CN"/>
-        </w:rPr>
-        <w:t>2</w:t>
-      </w:r>
-      <w:r>
-        <w:rPr>
-          <w:rFonts w:hint="default" w:ascii="Calibri" w:hAnsi="Calibri" w:cs="Calibri"/>
-          <w:b/>
-          <w:bCs/>
-          <w:sz w:val="24"/>
-          <w:szCs w:val="24"/>
-          <w:lang w:val="en-US" w:eastAsia="zh-CN"/>
-        </w:rPr>
-        <w:t>.</w:t>
-      </w:r>
+    </w:p>
+    <w:p>
+      <w:pPr>
+        <w:pStyle w:val="12"/>
+        <w:keepNext w:val="0"/>
+        <w:keepLines w:val="0"/>
+        <w:widowControl/>
+        <w:numPr>
+          <w:ilvl w:val="0"/>
+          <w:numId w:val="2"/>
+        </w:numPr>
+        <w:suppressLineNumbers w:val="0"/>
+        <w:spacing w:after="159" w:afterLines="50" w:afterAutospacing="0"/>
+        <w:ind w:left="425" w:leftChars="0" w:hanging="425" w:firstLineChars="0"/>
+        <w:jc w:val="center"/>
+        <w:rPr>
+          <w:rFonts w:hint="default" w:ascii="Calibri" w:hAnsi="Calibri" w:cs="Calibri"/>
+          <w:sz w:val="24"/>
+          <w:szCs w:val="24"/>
+          <w:lang w:val="en-US" w:eastAsia="zh-CN"/>
+        </w:rPr>
+      </w:pPr>
     </w:p>
     <w:p>
       <w:pPr>
@@ -1328,6 +1308,8 @@
         <w:jc w:val="center"/>
         <w:rPr>
           <w:rFonts w:hint="default" w:ascii="Calibri" w:hAnsi="Calibri" w:cs="Calibri"/>
+          <w:b/>
+          <w:bCs/>
           <w:sz w:val="24"/>
           <w:szCs w:val="24"/>
           <w:lang w:val="en-US" w:eastAsia="zh-CN"/>
@@ -1344,28 +1326,25 @@
         </w:rPr>
         <w:t>————————————————————————————————</w:t>
       </w:r>
-      <w:r>
-        <w:rPr>
-          <w:rFonts w:hint="eastAsia" w:ascii="Calibri" w:hAnsi="Calibri" w:cs="Calibri"/>
-          <w:b/>
-          <w:bCs/>
-          <w:sz w:val="24"/>
-          <w:szCs w:val="24"/>
-          <w:lang w:val="en-US" w:eastAsia="zh-CN"/>
-        </w:rPr>
-        <w:t>3</w:t>
-      </w:r>
-      <w:r>
-        <w:rPr>
-          <w:rFonts w:hint="default" w:ascii="Calibri" w:hAnsi="Calibri" w:cs="Calibri"/>
-          <w:b/>
-          <w:bCs/>
-          <w:sz w:val="24"/>
-          <w:szCs w:val="24"/>
-          <w:lang w:val="en-US" w:eastAsia="zh-CN"/>
-        </w:rPr>
-        <w:t>.</w:t>
-      </w:r>
+    </w:p>
+    <w:p>
+      <w:pPr>
+        <w:numPr>
+          <w:ilvl w:val="0"/>
+          <w:numId w:val="2"/>
+        </w:numPr>
+        <w:bidi w:val="0"/>
+        <w:ind w:left="425" w:leftChars="0" w:hanging="425" w:firstLineChars="0"/>
+        <w:jc w:val="center"/>
+        <w:rPr>
+          <w:rFonts w:hint="default" w:ascii="Calibri" w:hAnsi="Calibri" w:cs="Calibri"/>
+          <w:b/>
+          <w:bCs/>
+          <w:sz w:val="24"/>
+          <w:szCs w:val="24"/>
+          <w:lang w:val="en-US" w:eastAsia="zh-CN"/>
+        </w:rPr>
+      </w:pPr>
     </w:p>
     <w:p>
       <w:pPr>
@@ -2296,50 +2275,44 @@
           <w:bCs/>
           <w:sz w:val="24"/>
           <w:szCs w:val="24"/>
+          <w:lang w:val="en-US" w:eastAsia="zh-CN"/>
+        </w:rPr>
+      </w:pPr>
+      <w:r>
+        <w:rPr>
+          <w:rFonts w:hint="eastAsia" w:ascii="Calibri" w:hAnsi="Calibri" w:cs="Calibri"/>
+          <w:b/>
+          <w:bCs/>
+          <w:sz w:val="24"/>
+          <w:szCs w:val="24"/>
           <w:lang w:eastAsia="zh-CN"/>
         </w:rPr>
-      </w:pPr>
-      <w:r>
+        <w:t>————————————————————————————————</w:t>
+      </w:r>
+    </w:p>
+    <w:p>
+      <w:pPr>
+        <w:pStyle w:val="12"/>
+        <w:keepNext w:val="0"/>
+        <w:keepLines w:val="0"/>
+        <w:widowControl/>
+        <w:numPr>
+          <w:ilvl w:val="0"/>
+          <w:numId w:val="2"/>
+        </w:numPr>
+        <w:suppressLineNumbers w:val="0"/>
+        <w:spacing w:before="0" w:beforeAutospacing="0" w:after="0" w:afterAutospacing="0"/>
+        <w:ind w:left="425" w:leftChars="0" w:hanging="425" w:firstLineChars="0"/>
+        <w:jc w:val="center"/>
         <w:rPr>
           <w:rFonts w:hint="eastAsia" w:ascii="Calibri" w:hAnsi="Calibri" w:cs="Calibri"/>
           <w:b/>
           <w:bCs/>
           <w:sz w:val="24"/>
           <w:szCs w:val="24"/>
-          <w:lang w:eastAsia="zh-CN"/>
-        </w:rPr>
-        <w:t>————————————————————————————————</w:t>
-      </w:r>
-    </w:p>
-    <w:p>
-      <w:pPr>
-        <w:pStyle w:val="12"/>
-        <w:keepNext w:val="0"/>
-        <w:keepLines w:val="0"/>
-        <w:widowControl/>
-        <w:suppressLineNumbers w:val="0"/>
-        <w:spacing w:before="0" w:beforeAutospacing="0" w:after="0" w:afterAutospacing="0"/>
-        <w:jc w:val="center"/>
-        <w:rPr>
-          <w:rFonts w:hint="eastAsia" w:ascii="Calibri" w:hAnsi="Calibri" w:cs="Calibri"/>
-          <w:b/>
-          <w:bCs/>
-          <w:sz w:val="24"/>
-          <w:szCs w:val="24"/>
-          <w:lang w:val="en-US" w:eastAsia="zh-CN"/>
-        </w:rPr>
-      </w:pPr>
-      <w:r>
-        <w:rPr>
-          <w:rFonts w:hint="eastAsia" w:ascii="Calibri" w:hAnsi="Calibri" w:cs="Calibri"/>
-          <w:b/>
-          <w:bCs/>
-          <w:sz w:val="24"/>
-          <w:szCs w:val="24"/>
-          <w:lang w:val="en-US" w:eastAsia="zh-CN"/>
-        </w:rPr>
-        <w:t>4.</w:t>
-      </w:r>
+          <w:lang w:val="en-US" w:eastAsia="zh-CN"/>
+        </w:rPr>
+      </w:pPr>
     </w:p>
     <w:p>
       <w:pPr>
@@ -2645,6 +2618,12 @@
         <w:widowControl/>
         <w:suppressLineNumbers w:val="0"/>
         <w:spacing w:before="0" w:beforeAutospacing="0" w:after="0" w:afterAutospacing="0"/>
+        <w:rPr>
+          <w:rFonts w:hint="eastAsia"/>
+          <w:b/>
+          <w:bCs/>
+          <w:lang w:val="en-US" w:eastAsia="zh-CN"/>
+        </w:rPr>
       </w:pPr>
       <w:r>
         <w:rPr>
@@ -2664,23 +2643,19 @@
         <w:keepNext w:val="0"/>
         <w:keepLines w:val="0"/>
         <w:widowControl/>
+        <w:numPr>
+          <w:ilvl w:val="0"/>
+          <w:numId w:val="2"/>
+        </w:numPr>
         <w:suppressLineNumbers w:val="0"/>
         <w:spacing w:before="0" w:beforeAutospacing="0" w:after="0" w:afterAutospacing="0"/>
+        <w:ind w:left="425" w:leftChars="0" w:hanging="425" w:firstLineChars="0"/>
         <w:jc w:val="center"/>
         <w:rPr>
           <w:rFonts w:hint="eastAsia"/>
           <w:lang w:val="en-US" w:eastAsia="zh-CN"/>
         </w:rPr>
       </w:pPr>
-      <w:r>
-        <w:rPr>
-          <w:rFonts w:hint="eastAsia"/>
-          <w:b/>
-          <w:bCs/>
-          <w:lang w:val="en-US" w:eastAsia="zh-CN"/>
-        </w:rPr>
-        <w:t>5.</w:t>
-      </w:r>
     </w:p>
     <w:p>
       <w:pPr>
@@ -3598,7 +3573,7 @@
           <w:bCs/>
           <w:sz w:val="24"/>
           <w:szCs w:val="24"/>
-          <w:lang w:val="en-US" w:eastAsia="zh-CN"/>
+          <w:lang w:eastAsia="zh-CN"/>
         </w:rPr>
       </w:pPr>
       <w:r>
@@ -3612,28 +3587,29 @@
         </w:rPr>
         <w:t>————————————————————————————————</w:t>
       </w:r>
-      <w:r>
+    </w:p>
+    <w:p>
+      <w:pPr>
+        <w:pStyle w:val="12"/>
+        <w:keepNext w:val="0"/>
+        <w:keepLines w:val="0"/>
+        <w:widowControl/>
+        <w:numPr>
+          <w:ilvl w:val="0"/>
+          <w:numId w:val="2"/>
+        </w:numPr>
+        <w:suppressLineNumbers w:val="0"/>
+        <w:ind w:left="425" w:leftChars="0" w:hanging="425" w:firstLineChars="0"/>
+        <w:jc w:val="center"/>
         <w:rPr>
           <w:rFonts w:hint="eastAsia" w:ascii="Calibri" w:hAnsi="Calibri" w:cs="Calibri"/>
           <w:b/>
           <w:bCs/>
           <w:sz w:val="24"/>
           <w:szCs w:val="24"/>
-          <w:lang w:eastAsia="zh-CN"/>
-        </w:rPr>
-        <w:br w:type="textWrapping"/>
-      </w:r>
-      <w:r>
-        <w:rPr>
-          <w:rFonts w:hint="eastAsia" w:ascii="Calibri" w:hAnsi="Calibri" w:cs="Calibri"/>
-          <w:b/>
-          <w:bCs/>
-          <w:sz w:val="24"/>
-          <w:szCs w:val="24"/>
-          <w:lang w:val="en-US" w:eastAsia="zh-CN"/>
-        </w:rPr>
-        <w:t>6.</w:t>
-      </w:r>
+          <w:lang w:val="en-US" w:eastAsia="zh-CN"/>
+        </w:rPr>
+      </w:pPr>
     </w:p>
     <w:p>
       <w:pPr>
@@ -4030,11 +4006,11 @@
         <w:jc w:val="center"/>
         <w:rPr>
           <w:rFonts w:hint="eastAsia" w:ascii="Calibri" w:hAnsi="Calibri" w:cs="Calibri"/>
-          <w:b w:val="0"/>
-          <w:bCs w:val="0"/>
-          <w:sz w:val="24"/>
-          <w:szCs w:val="24"/>
-          <w:lang w:val="en-US" w:eastAsia="zh-CN"/>
+          <w:b/>
+          <w:bCs/>
+          <w:sz w:val="24"/>
+          <w:szCs w:val="24"/>
+          <w:lang w:eastAsia="zh-CN"/>
         </w:rPr>
       </w:pPr>
       <w:r>
@@ -4048,7 +4024,20 @@
         </w:rPr>
         <w:t>————————————————————————————————</w:t>
       </w:r>
-      <w:r>
+    </w:p>
+    <w:p>
+      <w:pPr>
+        <w:pStyle w:val="12"/>
+        <w:keepNext w:val="0"/>
+        <w:keepLines w:val="0"/>
+        <w:widowControl/>
+        <w:numPr>
+          <w:ilvl w:val="0"/>
+          <w:numId w:val="2"/>
+        </w:numPr>
+        <w:suppressLineNumbers w:val="0"/>
+        <w:ind w:left="425" w:leftChars="0" w:hanging="425" w:firstLineChars="0"/>
+        <w:jc w:val="center"/>
         <w:rPr>
           <w:rFonts w:hint="eastAsia" w:ascii="Calibri" w:hAnsi="Calibri" w:cs="Calibri"/>
           <w:b/>
@@ -4057,19 +4046,7 @@
           <w:szCs w:val="24"/>
           <w:lang w:eastAsia="zh-CN"/>
         </w:rPr>
-        <w:br w:type="textWrapping"/>
-      </w:r>
-      <w:r>
-        <w:rPr>
-          <w:rFonts w:hint="eastAsia" w:ascii="Calibri" w:hAnsi="Calibri" w:cs="Calibri"/>
-          <w:b/>
-          <w:bCs/>
-          <w:sz w:val="24"/>
-          <w:szCs w:val="24"/>
-          <w:lang w:val="en-US" w:eastAsia="zh-CN"/>
-        </w:rPr>
-        <w:t>7.</w:t>
-      </w:r>
+      </w:pPr>
     </w:p>
     <w:p>
       <w:pPr>
@@ -5078,7 +5055,7 @@
           <w:bCs/>
           <w:sz w:val="24"/>
           <w:szCs w:val="24"/>
-          <w:lang w:eastAsia="zh-CN"/>
+          <w:lang w:val="en-US" w:eastAsia="zh-CN"/>
         </w:rPr>
       </w:pPr>
       <w:r>
@@ -5155,7 +5132,13 @@
         <w:keepNext w:val="0"/>
         <w:keepLines w:val="0"/>
         <w:widowControl/>
-        <w:suppressLineNumbers w:val="0"/>
+        <w:numPr>
+          <w:ilvl w:val="0"/>
+          <w:numId w:val="2"/>
+        </w:numPr>
+        <w:suppressLineNumbers w:val="0"/>
+        <w:spacing w:before="0" w:beforeAutospacing="0" w:after="0" w:afterAutospacing="0"/>
+        <w:ind w:left="425" w:leftChars="0" w:hanging="425" w:firstLineChars="0"/>
         <w:jc w:val="center"/>
         <w:rPr>
           <w:rFonts w:hint="eastAsia" w:ascii="Calibri" w:hAnsi="Calibri" w:cs="Calibri"/>
@@ -5163,250 +5146,9 @@
           <w:bCs/>
           <w:sz w:val="24"/>
           <w:szCs w:val="24"/>
-          <w:vertAlign w:val="baseline"/>
-          <w:lang w:val="en-US" w:eastAsia="zh-CN"/>
-        </w:rPr>
-      </w:pPr>
-      <w:r>
-        <w:rPr>
-          <w:rFonts w:hint="eastAsia" w:ascii="Calibri" w:hAnsi="Calibri" w:cs="Calibri"/>
-          <w:b/>
-          <w:bCs/>
-          <w:sz w:val="24"/>
-          <w:szCs w:val="24"/>
-          <w:vertAlign w:val="baseline"/>
-          <w:lang w:val="en-US" w:eastAsia="zh-CN"/>
-        </w:rPr>
-        <w:t>8.</w:t>
-      </w:r>
-    </w:p>
-    <w:p>
-      <w:pPr>
-        <w:keepNext w:val="0"/>
-        <w:keepLines w:val="0"/>
-        <w:widowControl/>
-        <w:suppressLineNumbers w:val="0"/>
-        <w:pBdr>
-          <w:top w:val="none" w:color="auto" w:sz="0" w:space="0"/>
-          <w:left w:val="none" w:color="auto" w:sz="0" w:space="0"/>
-          <w:bottom w:val="none" w:color="auto" w:sz="0" w:space="0"/>
-          <w:right w:val="none" w:color="auto" w:sz="0" w:space="0"/>
-        </w:pBdr>
-        <w:shd w:val="clear" w:fill="FFFFFF"/>
-        <w:bidi w:val="0"/>
-        <w:spacing w:before="0" w:beforeAutospacing="0" w:after="0" w:afterAutospacing="0"/>
-        <w:ind w:left="0" w:right="0" w:firstLine="0"/>
-        <w:jc w:val="left"/>
-        <w:textAlignment w:val="baseline"/>
-        <w:rPr>
-          <w:rFonts w:hint="default" w:ascii="Calibri" w:hAnsi="Calibri" w:cs="Calibri"/>
-          <w:b/>
-          <w:bCs/>
-          <w:color w:val="FF0000"/>
-          <w:sz w:val="24"/>
-          <w:szCs w:val="24"/>
-          <w:lang w:val="en-US" w:eastAsia="zh-CN"/>
-        </w:rPr>
-      </w:pPr>
-      <w:r>
-        <w:rPr>
-          <w:rFonts w:hint="default" w:ascii="Calibri" w:hAnsi="Calibri" w:cs="Calibri"/>
-          <w:b/>
-          <w:bCs/>
-          <w:color w:val="FF0000"/>
-          <w:sz w:val="24"/>
-          <w:szCs w:val="24"/>
-          <w:lang w:val="en-US" w:eastAsia="zh-CN"/>
-        </w:rPr>
-        <w:t>Q: “</w:t>
-      </w:r>
-      <w:r>
-        <w:rPr>
-          <w:rFonts w:hint="default" w:ascii="Calibri" w:hAnsi="Calibri" w:eastAsia="Arial" w:cs="Calibri"/>
-          <w:b/>
-          <w:bCs/>
-          <w:i w:val="0"/>
-          <w:iCs w:val="0"/>
-          <w:caps w:val="0"/>
-          <w:color w:val="FF0000"/>
-          <w:spacing w:val="0"/>
-          <w:kern w:val="0"/>
-          <w:sz w:val="24"/>
-          <w:szCs w:val="24"/>
-          <w:shd w:val="clear" w:fill="FFFFFF"/>
-          <w:vertAlign w:val="baseline"/>
-          <w:lang w:val="en-US" w:eastAsia="zh-CN" w:bidi="ar"/>
-        </w:rPr>
-        <w:t>What’s the next step with this?”</w:t>
-      </w:r>
-    </w:p>
-    <w:p>
-      <w:pPr>
-        <w:pStyle w:val="12"/>
-        <w:keepNext w:val="0"/>
-        <w:keepLines w:val="0"/>
-        <w:widowControl/>
-        <w:suppressLineNumbers w:val="0"/>
-        <w:rPr>
-          <w:rFonts w:hint="default"/>
-          <w:b/>
-          <w:bCs/>
-          <w:color w:val="0000FF"/>
-          <w:lang w:val="en-US" w:eastAsia="zh-CN"/>
-        </w:rPr>
-      </w:pPr>
-      <w:r>
-        <w:rPr>
-          <w:rFonts w:hint="eastAsia" w:ascii="Calibri" w:hAnsi="Calibri" w:cs="Calibri"/>
-          <w:b/>
-          <w:bCs/>
-          <w:color w:val="0000FF"/>
-          <w:sz w:val="24"/>
-          <w:szCs w:val="24"/>
-          <w:lang w:val="en-US" w:eastAsia="zh-CN"/>
-        </w:rPr>
-        <w:t xml:space="preserve">A: </w:t>
-      </w:r>
-      <w:r>
-        <w:rPr>
-          <w:rFonts w:hint="default" w:ascii="Calibri" w:hAnsi="Calibri" w:cs="Calibri"/>
-          <w:b/>
-          <w:bCs/>
-          <w:color w:val="0000FF"/>
-          <w:sz w:val="24"/>
-          <w:szCs w:val="24"/>
-          <w:lang w:val="en-US" w:eastAsia="zh-CN"/>
-        </w:rPr>
-        <w:t>“</w:t>
-      </w:r>
-      <w:r>
-        <w:rPr>
-          <w:color w:val="0000FF"/>
-        </w:rPr>
-        <w:t>I want to apologize for the length and occasional redundancy in the two PDFs—I relied on AI assistance to ensure grammatical accuracy and structural coherence, which unfortunately made the documents longer and less concise than ideal.</w:t>
-      </w:r>
-      <w:r>
-        <w:rPr>
-          <w:b/>
-          <w:bCs/>
-          <w:color w:val="0000FF"/>
-        </w:rPr>
-        <w:t xml:space="preserve"> I plan to revise them,</w:t>
-      </w:r>
-      <w:r>
-        <w:rPr>
-          <w:rFonts w:hint="eastAsia"/>
-          <w:b/>
-          <w:bCs/>
-          <w:color w:val="0000FF"/>
-          <w:lang w:val="en-US" w:eastAsia="zh-CN"/>
-        </w:rPr>
-        <w:t xml:space="preserve"> make more versions in other languages,</w:t>
-      </w:r>
-      <w:r>
-        <w:rPr>
-          <w:b/>
-          <w:bCs/>
-          <w:color w:val="0000FF"/>
-        </w:rPr>
-        <w:t xml:space="preserve"> streamline the arguments, and possibly create a video format to communicate the core ideas more clearly</w:t>
-      </w:r>
-      <w:r>
-        <w:rPr>
-          <w:rFonts w:hint="eastAsia"/>
-          <w:b/>
-          <w:bCs/>
-          <w:color w:val="0000FF"/>
-          <w:lang w:val="en-US" w:eastAsia="zh-CN"/>
-        </w:rPr>
-        <w:t xml:space="preserve"> in the future when I have time</w:t>
-      </w:r>
-      <w:r>
-        <w:rPr>
-          <w:b/>
-          <w:bCs/>
-          <w:color w:val="0000FF"/>
-        </w:rPr>
-        <w:t>.</w:t>
-      </w:r>
-      <w:r>
-        <w:rPr>
-          <w:rFonts w:hint="eastAsia"/>
-          <w:b/>
-          <w:bCs/>
-          <w:color w:val="0000FF"/>
-          <w:lang w:val="en-US" w:eastAsia="zh-CN"/>
-        </w:rPr>
-        <w:t xml:space="preserve"> </w:t>
-      </w:r>
-      <w:r>
-        <w:rPr>
-          <w:rFonts w:hint="default"/>
-          <w:b/>
-          <w:bCs/>
-          <w:color w:val="0000FF"/>
-          <w:lang w:val="en-US" w:eastAsia="zh-CN"/>
-        </w:rPr>
-        <w:t>”</w:t>
-      </w:r>
-    </w:p>
-    <w:p>
-      <w:pPr>
-        <w:pStyle w:val="12"/>
-        <w:keepNext w:val="0"/>
-        <w:keepLines w:val="0"/>
-        <w:widowControl/>
-        <w:suppressLineNumbers w:val="0"/>
-        <w:rPr>
-          <w:rFonts w:hint="eastAsia" w:ascii="Calibri" w:hAnsi="Calibri" w:cs="Calibri"/>
-          <w:b w:val="0"/>
-          <w:bCs w:val="0"/>
-          <w:sz w:val="24"/>
-          <w:szCs w:val="24"/>
-          <w:lang w:val="en-US" w:eastAsia="zh-CN"/>
-        </w:rPr>
-      </w:pPr>
-      <w:r>
-        <w:rPr>
-          <w:rFonts w:hint="eastAsia" w:ascii="Calibri" w:hAnsi="Calibri" w:cs="Calibri"/>
-          <w:b/>
-          <w:bCs/>
-          <w:sz w:val="24"/>
-          <w:szCs w:val="24"/>
-          <w:lang w:eastAsia="zh-CN"/>
-        </w:rPr>
-        <w:t>————————————————————————————————</w:t>
-      </w:r>
-    </w:p>
-    <w:p>
-      <w:pPr>
-        <w:pStyle w:val="12"/>
-        <w:keepNext w:val="0"/>
-        <w:keepLines w:val="0"/>
-        <w:widowControl/>
-        <w:suppressLineNumbers w:val="0"/>
-        <w:spacing w:before="0" w:beforeAutospacing="0" w:after="0" w:afterAutospacing="0"/>
-        <w:jc w:val="center"/>
-        <w:rPr>
-          <w:rFonts w:hint="eastAsia" w:ascii="Calibri" w:hAnsi="Calibri" w:cs="Calibri"/>
-          <w:b/>
-          <w:bCs/>
-          <w:sz w:val="24"/>
-          <w:szCs w:val="24"/>
-          <w:lang w:val="en-US" w:eastAsia="zh-CN"/>
-        </w:rPr>
-      </w:pPr>
-      <w:r>
-        <w:rPr>
-          <w:rFonts w:hint="eastAsia" w:ascii="Calibri" w:hAnsi="Calibri" w:cs="Calibri"/>
-          <w:b/>
-          <w:bCs/>
-          <w:sz w:val="24"/>
-          <w:szCs w:val="24"/>
-          <w:lang w:val="en-US" w:eastAsia="zh-CN"/>
-        </w:rPr>
-        <w:t>9.</w:t>
-      </w:r>
+          <w:lang w:val="en-US" w:eastAsia="zh-CN"/>
+        </w:rPr>
+      </w:pPr>
     </w:p>
     <w:p>
       <w:pPr>
@@ -6034,50 +5776,44 @@
           <w:bCs/>
           <w:sz w:val="24"/>
           <w:szCs w:val="24"/>
+          <w:lang w:val="en-US" w:eastAsia="zh-CN"/>
+        </w:rPr>
+      </w:pPr>
+      <w:r>
+        <w:rPr>
+          <w:rFonts w:hint="eastAsia" w:ascii="Calibri" w:hAnsi="Calibri" w:cs="Calibri"/>
+          <w:b/>
+          <w:bCs/>
+          <w:sz w:val="24"/>
+          <w:szCs w:val="24"/>
           <w:lang w:eastAsia="zh-CN"/>
         </w:rPr>
-      </w:pPr>
-      <w:r>
+        <w:t>————————————————————————————————</w:t>
+      </w:r>
+    </w:p>
+    <w:p>
+      <w:pPr>
+        <w:pStyle w:val="12"/>
+        <w:keepNext w:val="0"/>
+        <w:keepLines w:val="0"/>
+        <w:widowControl/>
+        <w:numPr>
+          <w:ilvl w:val="0"/>
+          <w:numId w:val="2"/>
+        </w:numPr>
+        <w:suppressLineNumbers w:val="0"/>
+        <w:spacing w:before="0" w:beforeAutospacing="0" w:after="0" w:afterAutospacing="0"/>
+        <w:ind w:left="425" w:leftChars="0" w:hanging="425" w:firstLineChars="0"/>
+        <w:jc w:val="center"/>
         <w:rPr>
           <w:rFonts w:hint="eastAsia" w:ascii="Calibri" w:hAnsi="Calibri" w:cs="Calibri"/>
           <w:b/>
           <w:bCs/>
           <w:sz w:val="24"/>
           <w:szCs w:val="24"/>
-          <w:lang w:eastAsia="zh-CN"/>
-        </w:rPr>
-        <w:t>————————————————————————————————</w:t>
-      </w:r>
-    </w:p>
-    <w:p>
-      <w:pPr>
-        <w:pStyle w:val="12"/>
-        <w:keepNext w:val="0"/>
-        <w:keepLines w:val="0"/>
-        <w:widowControl/>
-        <w:suppressLineNumbers w:val="0"/>
-        <w:spacing w:before="0" w:beforeAutospacing="0" w:after="0" w:afterAutospacing="0"/>
-        <w:jc w:val="center"/>
-        <w:rPr>
-          <w:rFonts w:hint="eastAsia" w:ascii="Calibri" w:hAnsi="Calibri" w:cs="Calibri"/>
-          <w:b/>
-          <w:bCs/>
-          <w:sz w:val="24"/>
-          <w:szCs w:val="24"/>
-          <w:lang w:val="en-US" w:eastAsia="zh-CN"/>
-        </w:rPr>
-      </w:pPr>
-      <w:r>
-        <w:rPr>
-          <w:rFonts w:hint="eastAsia" w:ascii="Calibri" w:hAnsi="Calibri" w:cs="Calibri"/>
-          <w:b/>
-          <w:bCs/>
-          <w:sz w:val="24"/>
-          <w:szCs w:val="24"/>
-          <w:lang w:val="en-US" w:eastAsia="zh-CN"/>
-        </w:rPr>
-        <w:t>10.</w:t>
-      </w:r>
+          <w:lang w:val="en-US" w:eastAsia="zh-CN"/>
+        </w:rPr>
+      </w:pPr>
     </w:p>
     <w:p>
       <w:pPr>
@@ -6800,50 +6536,44 @@
           <w:bCs/>
           <w:sz w:val="24"/>
           <w:szCs w:val="24"/>
+          <w:lang w:val="en-US" w:eastAsia="zh-CN"/>
+        </w:rPr>
+      </w:pPr>
+      <w:r>
+        <w:rPr>
+          <w:rFonts w:hint="eastAsia" w:ascii="Calibri" w:hAnsi="Calibri" w:cs="Calibri"/>
+          <w:b/>
+          <w:bCs/>
+          <w:sz w:val="24"/>
+          <w:szCs w:val="24"/>
           <w:lang w:eastAsia="zh-CN"/>
         </w:rPr>
-      </w:pPr>
-      <w:r>
+        <w:t>————————————————————————————————</w:t>
+      </w:r>
+    </w:p>
+    <w:p>
+      <w:pPr>
+        <w:pStyle w:val="12"/>
+        <w:keepNext w:val="0"/>
+        <w:keepLines w:val="0"/>
+        <w:widowControl/>
+        <w:numPr>
+          <w:ilvl w:val="0"/>
+          <w:numId w:val="2"/>
+        </w:numPr>
+        <w:suppressLineNumbers w:val="0"/>
+        <w:spacing w:before="0" w:beforeAutospacing="0" w:after="0" w:afterAutospacing="0"/>
+        <w:ind w:left="425" w:leftChars="0" w:hanging="425" w:firstLineChars="0"/>
+        <w:jc w:val="center"/>
         <w:rPr>
           <w:rFonts w:hint="eastAsia" w:ascii="Calibri" w:hAnsi="Calibri" w:cs="Calibri"/>
           <w:b/>
           <w:bCs/>
           <w:sz w:val="24"/>
           <w:szCs w:val="24"/>
-          <w:lang w:eastAsia="zh-CN"/>
-        </w:rPr>
-        <w:t>————————————————————————————————</w:t>
-      </w:r>
-    </w:p>
-    <w:p>
-      <w:pPr>
-        <w:pStyle w:val="12"/>
-        <w:keepNext w:val="0"/>
-        <w:keepLines w:val="0"/>
-        <w:widowControl/>
-        <w:suppressLineNumbers w:val="0"/>
-        <w:spacing w:before="0" w:beforeAutospacing="0" w:after="0" w:afterAutospacing="0"/>
-        <w:jc w:val="center"/>
-        <w:rPr>
-          <w:rFonts w:hint="eastAsia" w:ascii="Calibri" w:hAnsi="Calibri" w:cs="Calibri"/>
-          <w:b/>
-          <w:bCs/>
-          <w:sz w:val="24"/>
-          <w:szCs w:val="24"/>
-          <w:lang w:val="en-US" w:eastAsia="zh-CN"/>
-        </w:rPr>
-      </w:pPr>
-      <w:r>
-        <w:rPr>
-          <w:rFonts w:hint="eastAsia" w:ascii="Calibri" w:hAnsi="Calibri" w:cs="Calibri"/>
-          <w:b/>
-          <w:bCs/>
-          <w:sz w:val="24"/>
-          <w:szCs w:val="24"/>
-          <w:lang w:val="en-US" w:eastAsia="zh-CN"/>
-        </w:rPr>
-        <w:t>11.</w:t>
-      </w:r>
+          <w:lang w:val="en-US" w:eastAsia="zh-CN"/>
+        </w:rPr>
+      </w:pPr>
     </w:p>
     <w:p>
       <w:pPr>
@@ -7289,8 +7019,13 @@
         <w:keepNext w:val="0"/>
         <w:keepLines w:val="0"/>
         <w:widowControl/>
+        <w:numPr>
+          <w:ilvl w:val="0"/>
+          <w:numId w:val="2"/>
+        </w:numPr>
         <w:suppressLineNumbers w:val="0"/>
         <w:spacing w:before="0" w:beforeAutospacing="0" w:after="0" w:afterAutospacing="0"/>
+        <w:ind w:left="425" w:leftChars="0" w:hanging="425" w:firstLineChars="0"/>
         <w:jc w:val="center"/>
         <w:rPr>
           <w:rFonts w:hint="eastAsia" w:ascii="Calibri" w:hAnsi="Calibri" w:cs="Calibri"/>
@@ -7301,17 +7036,6 @@
           <w:lang w:val="en-US" w:eastAsia="zh-CN"/>
         </w:rPr>
       </w:pPr>
-      <w:r>
-        <w:rPr>
-          <w:rFonts w:hint="eastAsia" w:ascii="Calibri" w:hAnsi="Calibri" w:cs="Calibri"/>
-          <w:b/>
-          <w:bCs/>
-          <w:sz w:val="24"/>
-          <w:szCs w:val="24"/>
-          <w:lang w:val="en-US" w:eastAsia="zh-CN"/>
-        </w:rPr>
-        <w:t>12.</w:t>
-      </w:r>
     </w:p>
     <w:p>
       <w:pPr>
@@ -8220,7 +7944,7 @@
         <w:widowControl/>
         <w:numPr>
           <w:ilvl w:val="0"/>
-          <w:numId w:val="2"/>
+          <w:numId w:val="3"/>
         </w:numPr>
         <w:suppressLineNumbers w:val="0"/>
         <w:spacing w:before="0" w:beforeAutospacing="1" w:after="0" w:afterAutospacing="1" w:line="150" w:lineRule="atLeast"/>
@@ -8296,7 +8020,7 @@
         <w:widowControl/>
         <w:numPr>
           <w:ilvl w:val="0"/>
-          <w:numId w:val="2"/>
+          <w:numId w:val="3"/>
         </w:numPr>
         <w:suppressLineNumbers w:val="0"/>
         <w:spacing w:before="0" w:beforeAutospacing="1" w:after="0" w:afterAutospacing="1" w:line="150" w:lineRule="atLeast"/>
@@ -8426,12 +8150,9 @@
         <w:jc w:val="left"/>
         <w:rPr>
           <w:rFonts w:hint="default" w:ascii="Calibri" w:hAnsi="Calibri" w:cs="Calibri"/>
-          <w:b/>
-          <w:bCs/>
-          <w:color w:val="0000FF"/>
-          <w:sz w:val="24"/>
-          <w:szCs w:val="24"/>
-          <w:lang w:val="en-US"/>
+          <w:color w:val="0000FF"/>
+          <w:sz w:val="24"/>
+          <w:szCs w:val="24"/>
         </w:rPr>
       </w:pPr>
       <w:r>
@@ -8473,25 +8194,6 @@
         </w:rPr>
         <w:t>]</w:t>
       </w:r>
-    </w:p>
-    <w:p>
-      <w:pPr>
-        <w:keepNext w:val="0"/>
-        <w:keepLines w:val="0"/>
-        <w:widowControl/>
-        <w:numPr>
-          <w:ilvl w:val="0"/>
-          <w:numId w:val="0"/>
-        </w:numPr>
-        <w:suppressLineNumbers w:val="0"/>
-        <w:spacing w:before="0" w:beforeAutospacing="1" w:after="0" w:afterAutospacing="1" w:line="150" w:lineRule="atLeast"/>
-        <w:rPr>
-          <w:rFonts w:hint="default" w:ascii="Calibri" w:hAnsi="Calibri" w:cs="Calibri"/>
-          <w:color w:val="0000FF"/>
-          <w:sz w:val="24"/>
-          <w:szCs w:val="24"/>
-        </w:rPr>
-      </w:pPr>
     </w:p>
     <w:p>
       <w:pPr>
@@ -8739,20 +8441,12 @@
         <w:widowControl/>
         <w:suppressLineNumbers w:val="0"/>
         <w:jc w:val="left"/>
-        <w:rPr>
-          <w:rFonts w:hint="default"/>
-          <w:b/>
-          <w:bCs/>
-          <w:i/>
-          <w:iCs/>
-          <w:lang w:val="en-US" w:eastAsia="zh-CN"/>
-        </w:rPr>
       </w:pPr>
       <w:r>
         <w:drawing>
           <wp:inline distT="0" distB="0" distL="114300" distR="114300">
-            <wp:extent cx="4280535" cy="4220845"/>
-            <wp:effectExtent l="9525" t="9525" r="15240" b="17780"/>
+            <wp:extent cx="3738880" cy="3686810"/>
+            <wp:effectExtent l="9525" t="9525" r="13970" b="18415"/>
             <wp:docPr id="4" name="图片 2"/>
             <wp:cNvGraphicFramePr>
               <a:graphicFrameLocks xmlns:a="http://schemas.openxmlformats.org/drawingml/2006/main" noChangeAspect="1"/>
@@ -8775,7 +8469,7 @@
                   <pic:spPr>
                     <a:xfrm>
                       <a:off x="0" y="0"/>
-                      <a:ext cx="4280535" cy="4220845"/>
+                      <a:ext cx="3738880" cy="3686810"/>
                     </a:xfrm>
                     <a:prstGeom prst="rect">
                       <a:avLst/>
@@ -8796,73 +8490,16 @@
     </w:p>
     <w:p>
       <w:pPr>
-        <w:pStyle w:val="12"/>
-        <w:keepNext w:val="0"/>
-        <w:keepLines w:val="0"/>
-        <w:pageBreakBefore w:val="0"/>
-        <w:widowControl/>
-        <w:suppressLineNumbers w:val="0"/>
-        <w:kinsoku/>
-        <w:wordWrap/>
-        <w:overflowPunct/>
-        <w:topLinePunct w:val="0"/>
-        <w:autoSpaceDE/>
-        <w:autoSpaceDN/>
-        <w:bidi w:val="0"/>
-        <w:adjustRightInd/>
-        <w:snapToGrid/>
-        <w:spacing w:before="315" w:beforeLines="100" w:beforeAutospacing="0" w:after="0" w:afterAutospacing="0" w:line="260" w:lineRule="auto"/>
-        <w:textAlignment w:val="auto"/>
-        <w:rPr>
-          <w:rFonts w:hint="eastAsia" w:ascii="Calibri" w:hAnsi="Calibri" w:cs="Calibri"/>
-          <w:b/>
-          <w:bCs/>
-          <w:sz w:val="24"/>
-          <w:szCs w:val="24"/>
-          <w:lang w:val="en-US" w:eastAsia="zh-CN"/>
-        </w:rPr>
-      </w:pPr>
-      <w:r>
-        <w:rPr>
-          <w:rFonts w:hint="eastAsia" w:ascii="Calibri" w:hAnsi="Calibri" w:cs="Calibri"/>
-          <w:b/>
-          <w:bCs/>
-          <w:sz w:val="24"/>
-          <w:szCs w:val="24"/>
-          <w:lang w:eastAsia="zh-CN"/>
-        </w:rPr>
-        <w:t>————————————————————————————————</w:t>
-      </w:r>
-    </w:p>
-    <w:p>
-      <w:pPr>
-        <w:pStyle w:val="12"/>
-        <w:keepNext w:val="0"/>
-        <w:keepLines w:val="0"/>
-        <w:widowControl/>
-        <w:suppressLineNumbers w:val="0"/>
-        <w:spacing w:before="0" w:beforeAutospacing="0" w:after="0" w:afterAutospacing="0"/>
-        <w:jc w:val="center"/>
-        <w:rPr>
-          <w:rFonts w:hint="eastAsia" w:ascii="Calibri" w:hAnsi="Calibri" w:cs="Calibri"/>
-          <w:b/>
-          <w:bCs/>
-          <w:sz w:val="24"/>
-          <w:szCs w:val="24"/>
-          <w:lang w:val="en-US" w:eastAsia="zh-CN"/>
-        </w:rPr>
-      </w:pPr>
-      <w:r>
-        <w:rPr>
-          <w:rFonts w:hint="eastAsia" w:ascii="Calibri" w:hAnsi="Calibri" w:cs="Calibri"/>
-          <w:b/>
-          <w:bCs/>
-          <w:sz w:val="24"/>
-          <w:szCs w:val="24"/>
-          <w:lang w:val="en-US" w:eastAsia="zh-CN"/>
-        </w:rPr>
-        <w:t>13.</w:t>
-      </w:r>
+        <w:keepNext w:val="0"/>
+        <w:keepLines w:val="0"/>
+        <w:widowControl/>
+        <w:suppressLineNumbers w:val="0"/>
+        <w:jc w:val="left"/>
+        <w:rPr>
+          <w:rFonts w:hint="default"/>
+          <w:lang w:val="en-US" w:eastAsia="zh-CN"/>
+        </w:rPr>
+      </w:pPr>
     </w:p>
     <w:p>
       <w:pPr>
@@ -8873,6 +8510,60 @@
         <w:spacing w:line="150" w:lineRule="atLeast"/>
         <w:jc w:val="left"/>
         <w:rPr>
+          <w:rFonts w:hint="default" w:ascii="Calibri" w:hAnsi="Calibri" w:eastAsia="宋体" w:cs="Calibri"/>
+          <w:b/>
+          <w:bCs/>
+          <w:color w:val="FF0000"/>
+          <w:kern w:val="2"/>
+          <w:sz w:val="24"/>
+          <w:szCs w:val="24"/>
+        </w:rPr>
+      </w:pPr>
+      <w:r>
+        <w:rPr>
+          <w:rFonts w:hint="eastAsia" w:ascii="Calibri" w:hAnsi="Calibri" w:cs="Calibri"/>
+          <w:b/>
+          <w:bCs/>
+          <w:sz w:val="24"/>
+          <w:szCs w:val="24"/>
+          <w:lang w:eastAsia="zh-CN"/>
+        </w:rPr>
+        <w:t>————————————————————————————————</w:t>
+      </w:r>
+    </w:p>
+    <w:p>
+      <w:pPr>
+        <w:keepNext w:val="0"/>
+        <w:keepLines w:val="0"/>
+        <w:widowControl/>
+        <w:numPr>
+          <w:ilvl w:val="0"/>
+          <w:numId w:val="2"/>
+        </w:numPr>
+        <w:suppressLineNumbers w:val="0"/>
+        <w:spacing w:line="150" w:lineRule="atLeast"/>
+        <w:ind w:left="425" w:leftChars="0" w:hanging="425" w:firstLineChars="0"/>
+        <w:jc w:val="center"/>
+        <w:rPr>
+          <w:rFonts w:hint="default" w:ascii="Calibri" w:hAnsi="Calibri" w:eastAsia="宋体" w:cs="Calibri"/>
+          <w:b/>
+          <w:bCs/>
+          <w:color w:val="FF0000"/>
+          <w:kern w:val="2"/>
+          <w:sz w:val="24"/>
+          <w:szCs w:val="24"/>
+        </w:rPr>
+      </w:pPr>
+    </w:p>
+    <w:p>
+      <w:pPr>
+        <w:keepNext w:val="0"/>
+        <w:keepLines w:val="0"/>
+        <w:widowControl/>
+        <w:suppressLineNumbers w:val="0"/>
+        <w:spacing w:beforeAutospacing="0" w:line="150" w:lineRule="atLeast"/>
+        <w:jc w:val="left"/>
+        <w:rPr>
           <w:rFonts w:hint="eastAsia" w:ascii="Calibri" w:hAnsi="Calibri" w:eastAsia="宋体" w:cs="Calibri"/>
           <w:b/>
           <w:bCs/>
@@ -9129,7 +8820,7 @@
         <w:widowControl/>
         <w:numPr>
           <w:ilvl w:val="0"/>
-          <w:numId w:val="3"/>
+          <w:numId w:val="4"/>
         </w:numPr>
         <w:suppressLineNumbers w:val="0"/>
         <w:spacing w:before="0" w:beforeAutospacing="0" w:after="120" w:afterAutospacing="0"/>
@@ -9165,7 +8856,7 @@
         <w:widowControl/>
         <w:numPr>
           <w:ilvl w:val="0"/>
-          <w:numId w:val="3"/>
+          <w:numId w:val="4"/>
         </w:numPr>
         <w:suppressLineNumbers w:val="0"/>
         <w:spacing w:before="0" w:beforeAutospacing="0" w:after="120" w:afterAutospacing="0"/>
@@ -9201,7 +8892,7 @@
         <w:widowControl/>
         <w:numPr>
           <w:ilvl w:val="0"/>
-          <w:numId w:val="3"/>
+          <w:numId w:val="4"/>
         </w:numPr>
         <w:suppressLineNumbers w:val="0"/>
         <w:spacing w:before="0" w:beforeAutospacing="0" w:after="120" w:afterAutospacing="0"/>
@@ -9237,7 +8928,7 @@
         <w:widowControl/>
         <w:numPr>
           <w:ilvl w:val="0"/>
-          <w:numId w:val="3"/>
+          <w:numId w:val="4"/>
         </w:numPr>
         <w:suppressLineNumbers w:val="0"/>
         <w:spacing w:before="0" w:beforeAutospacing="0" w:after="120" w:afterAutospacing="0"/>
@@ -9349,7 +9040,7 @@
         <w:widowControl/>
         <w:numPr>
           <w:ilvl w:val="0"/>
-          <w:numId w:val="3"/>
+          <w:numId w:val="4"/>
         </w:numPr>
         <w:suppressLineNumbers w:val="0"/>
         <w:spacing w:before="0" w:beforeAutospacing="0" w:after="120" w:afterAutospacing="0"/>
@@ -9385,7 +9076,7 @@
         <w:widowControl/>
         <w:numPr>
           <w:ilvl w:val="0"/>
-          <w:numId w:val="3"/>
+          <w:numId w:val="4"/>
         </w:numPr>
         <w:suppressLineNumbers w:val="0"/>
         <w:spacing w:before="0" w:beforeAutospacing="0" w:after="120" w:afterAutospacing="0"/>
@@ -9421,7 +9112,7 @@
         <w:widowControl/>
         <w:numPr>
           <w:ilvl w:val="0"/>
-          <w:numId w:val="3"/>
+          <w:numId w:val="4"/>
         </w:numPr>
         <w:suppressLineNumbers w:val="0"/>
         <w:spacing w:before="0" w:beforeAutospacing="0" w:after="120" w:afterAutospacing="0"/>
@@ -9457,7 +9148,7 @@
         <w:widowControl/>
         <w:numPr>
           <w:ilvl w:val="0"/>
-          <w:numId w:val="3"/>
+          <w:numId w:val="4"/>
         </w:numPr>
         <w:suppressLineNumbers w:val="0"/>
         <w:spacing w:before="0" w:beforeAutospacing="0" w:after="120" w:afterAutospacing="0"/>
@@ -9493,7 +9184,7 @@
         <w:widowControl/>
         <w:numPr>
           <w:ilvl w:val="0"/>
-          <w:numId w:val="3"/>
+          <w:numId w:val="4"/>
         </w:numPr>
         <w:suppressLineNumbers w:val="0"/>
         <w:spacing w:before="0" w:beforeAutospacing="0" w:after="120" w:afterAutospacing="0"/>
@@ -9793,39 +9484,29 @@
     </w:p>
     <w:p>
       <w:pPr>
-        <w:pStyle w:val="12"/>
-        <w:keepNext w:val="0"/>
-        <w:keepLines w:val="0"/>
-        <w:pageBreakBefore w:val="0"/>
-        <w:widowControl/>
-        <w:suppressLineNumbers w:val="0"/>
-        <w:kinsoku/>
-        <w:wordWrap/>
-        <w:overflowPunct/>
-        <w:topLinePunct w:val="0"/>
-        <w:autoSpaceDE/>
-        <w:autoSpaceDN/>
-        <w:bidi w:val="0"/>
-        <w:adjustRightInd/>
-        <w:snapToGrid/>
-        <w:spacing w:before="315" w:beforeLines="100" w:beforeAutospacing="0" w:after="0" w:afterAutospacing="0" w:line="260" w:lineRule="auto"/>
-        <w:textAlignment w:val="auto"/>
+        <w:keepNext w:val="0"/>
+        <w:keepLines w:val="0"/>
+        <w:widowControl/>
+        <w:suppressLineNumbers w:val="0"/>
+        <w:spacing w:beforeAutospacing="0" w:line="150" w:lineRule="atLeast"/>
+        <w:jc w:val="center"/>
+        <w:rPr>
+          <w:rFonts w:hint="default" w:ascii="Calibri" w:hAnsi="Calibri" w:eastAsia="宋体" w:cs="Calibri"/>
+          <w:b/>
+          <w:bCs/>
+          <w:color w:val="FF0000"/>
+          <w:kern w:val="2"/>
+          <w:sz w:val="24"/>
+          <w:szCs w:val="24"/>
+        </w:rPr>
+      </w:pPr>
+      <w:r>
         <w:rPr>
           <w:rFonts w:hint="eastAsia" w:ascii="Calibri" w:hAnsi="Calibri" w:cs="Calibri"/>
           <w:b/>
           <w:bCs/>
           <w:sz w:val="24"/>
           <w:szCs w:val="24"/>
-          <w:lang w:val="en-US" w:eastAsia="zh-CN"/>
-        </w:rPr>
-      </w:pPr>
-      <w:r>
-        <w:rPr>
-          <w:rFonts w:hint="eastAsia" w:ascii="Calibri" w:hAnsi="Calibri" w:cs="Calibri"/>
-          <w:b/>
-          <w:bCs/>
-          <w:sz w:val="24"/>
-          <w:szCs w:val="24"/>
           <w:lang w:eastAsia="zh-CN"/>
         </w:rPr>
         <w:t>————————————————————————————————</w:t>
@@ -9833,33 +9514,27 @@
     </w:p>
     <w:p>
       <w:pPr>
-        <w:pStyle w:val="12"/>
-        <w:keepNext w:val="0"/>
-        <w:keepLines w:val="0"/>
-        <w:widowControl/>
-        <w:suppressLineNumbers w:val="0"/>
-        <w:spacing w:before="0" w:beforeAutospacing="0" w:after="0" w:afterAutospacing="0"/>
+        <w:keepNext w:val="0"/>
+        <w:keepLines w:val="0"/>
+        <w:widowControl/>
+        <w:numPr>
+          <w:ilvl w:val="0"/>
+          <w:numId w:val="2"/>
+        </w:numPr>
+        <w:suppressLineNumbers w:val="0"/>
+        <w:spacing w:beforeAutospacing="0" w:line="150" w:lineRule="atLeast"/>
+        <w:ind w:left="425" w:leftChars="0" w:hanging="425" w:firstLineChars="0"/>
         <w:jc w:val="center"/>
         <w:rPr>
-          <w:rFonts w:hint="eastAsia" w:ascii="Calibri" w:hAnsi="Calibri" w:cs="Calibri"/>
-          <w:b/>
-          <w:bCs/>
-          <w:sz w:val="24"/>
-          <w:szCs w:val="24"/>
-          <w:lang w:val="en-US" w:eastAsia="zh-CN"/>
-        </w:rPr>
-      </w:pPr>
-      <w:r>
-        <w:rPr>
-          <w:rFonts w:hint="eastAsia" w:ascii="Calibri" w:hAnsi="Calibri" w:cs="Calibri"/>
-          <w:b/>
-          <w:bCs/>
-          <w:sz w:val="24"/>
-          <w:szCs w:val="24"/>
-          <w:lang w:val="en-US" w:eastAsia="zh-CN"/>
-        </w:rPr>
-        <w:t>14.</w:t>
-      </w:r>
+          <w:rFonts w:hint="default" w:ascii="Calibri" w:hAnsi="Calibri" w:eastAsia="宋体" w:cs="Calibri"/>
+          <w:b/>
+          <w:bCs/>
+          <w:color w:val="FF0000"/>
+          <w:kern w:val="2"/>
+          <w:sz w:val="24"/>
+          <w:szCs w:val="24"/>
+        </w:rPr>
+      </w:pPr>
     </w:p>
     <w:p>
       <w:pPr>
@@ -10335,7 +10010,7 @@
         <w:widowControl/>
         <w:numPr>
           <w:ilvl w:val="0"/>
-          <w:numId w:val="4"/>
+          <w:numId w:val="5"/>
         </w:numPr>
         <w:suppressLineNumbers w:val="0"/>
         <w:spacing w:before="0" w:beforeAutospacing="1" w:after="0" w:afterAutospacing="1"/>
@@ -10368,7 +10043,7 @@
         <w:widowControl/>
         <w:numPr>
           <w:ilvl w:val="0"/>
-          <w:numId w:val="4"/>
+          <w:numId w:val="5"/>
         </w:numPr>
         <w:suppressLineNumbers w:val="0"/>
         <w:spacing w:before="0" w:beforeAutospacing="1" w:after="0" w:afterAutospacing="1"/>
@@ -10529,39 +10204,29 @@
     </w:p>
     <w:p>
       <w:pPr>
-        <w:pStyle w:val="12"/>
-        <w:keepNext w:val="0"/>
-        <w:keepLines w:val="0"/>
-        <w:pageBreakBefore w:val="0"/>
-        <w:widowControl/>
-        <w:suppressLineNumbers w:val="0"/>
-        <w:kinsoku/>
-        <w:wordWrap/>
-        <w:overflowPunct/>
-        <w:topLinePunct w:val="0"/>
-        <w:autoSpaceDE/>
-        <w:autoSpaceDN/>
-        <w:bidi w:val="0"/>
-        <w:adjustRightInd/>
-        <w:snapToGrid/>
-        <w:spacing w:before="315" w:beforeLines="100" w:beforeAutospacing="0" w:after="0" w:afterAutospacing="0" w:line="260" w:lineRule="auto"/>
-        <w:textAlignment w:val="auto"/>
+        <w:keepNext w:val="0"/>
+        <w:keepLines w:val="0"/>
+        <w:widowControl/>
+        <w:suppressLineNumbers w:val="0"/>
+        <w:spacing w:beforeAutospacing="0" w:line="150" w:lineRule="atLeast"/>
+        <w:jc w:val="left"/>
+        <w:rPr>
+          <w:rFonts w:hint="default" w:ascii="Calibri" w:hAnsi="Calibri" w:eastAsia="宋体" w:cs="Calibri"/>
+          <w:b/>
+          <w:bCs/>
+          <w:color w:val="FF0000"/>
+          <w:kern w:val="2"/>
+          <w:sz w:val="24"/>
+          <w:szCs w:val="24"/>
+        </w:rPr>
+      </w:pPr>
+      <w:r>
         <w:rPr>
           <w:rFonts w:hint="eastAsia" w:ascii="Calibri" w:hAnsi="Calibri" w:cs="Calibri"/>
           <w:b/>
           <w:bCs/>
           <w:sz w:val="24"/>
           <w:szCs w:val="24"/>
-          <w:lang w:val="en-US" w:eastAsia="zh-CN"/>
-        </w:rPr>
-      </w:pPr>
-      <w:r>
-        <w:rPr>
-          <w:rFonts w:hint="eastAsia" w:ascii="Calibri" w:hAnsi="Calibri" w:cs="Calibri"/>
-          <w:b/>
-          <w:bCs/>
-          <w:sz w:val="24"/>
-          <w:szCs w:val="24"/>
           <w:lang w:eastAsia="zh-CN"/>
         </w:rPr>
         <w:t>————————————————————————————————</w:t>
@@ -10569,33 +10234,27 @@
     </w:p>
     <w:p>
       <w:pPr>
-        <w:pStyle w:val="12"/>
-        <w:keepNext w:val="0"/>
-        <w:keepLines w:val="0"/>
-        <w:widowControl/>
-        <w:suppressLineNumbers w:val="0"/>
-        <w:spacing w:before="0" w:beforeAutospacing="0" w:after="0" w:afterAutospacing="0"/>
+        <w:keepNext w:val="0"/>
+        <w:keepLines w:val="0"/>
+        <w:widowControl/>
+        <w:numPr>
+          <w:ilvl w:val="0"/>
+          <w:numId w:val="2"/>
+        </w:numPr>
+        <w:suppressLineNumbers w:val="0"/>
+        <w:spacing w:beforeAutospacing="0" w:line="150" w:lineRule="atLeast"/>
+        <w:ind w:left="425" w:leftChars="0" w:hanging="425" w:firstLineChars="0"/>
         <w:jc w:val="center"/>
         <w:rPr>
-          <w:rFonts w:hint="eastAsia" w:ascii="Calibri" w:hAnsi="Calibri" w:cs="Calibri"/>
-          <w:b/>
-          <w:bCs/>
-          <w:sz w:val="24"/>
-          <w:szCs w:val="24"/>
-          <w:lang w:val="en-US" w:eastAsia="zh-CN"/>
-        </w:rPr>
-      </w:pPr>
-      <w:r>
-        <w:rPr>
-          <w:rFonts w:hint="eastAsia" w:ascii="Calibri" w:hAnsi="Calibri" w:cs="Calibri"/>
-          <w:b/>
-          <w:bCs/>
-          <w:sz w:val="24"/>
-          <w:szCs w:val="24"/>
-          <w:lang w:val="en-US" w:eastAsia="zh-CN"/>
-        </w:rPr>
-        <w:t>15.</w:t>
-      </w:r>
+          <w:rFonts w:hint="default" w:ascii="Calibri" w:hAnsi="Calibri" w:eastAsia="宋体" w:cs="Calibri"/>
+          <w:b/>
+          <w:bCs/>
+          <w:color w:val="FF0000"/>
+          <w:kern w:val="2"/>
+          <w:sz w:val="24"/>
+          <w:szCs w:val="24"/>
+        </w:rPr>
+      </w:pPr>
     </w:p>
     <w:p>
       <w:pPr>
@@ -10881,6 +10540,7 @@
         <w:keepLines w:val="0"/>
         <w:widowControl/>
         <w:suppressLineNumbers w:val="0"/>
+        <w:spacing w:beforeAutospacing="0" w:line="150" w:lineRule="atLeast"/>
         <w:jc w:val="left"/>
       </w:pPr>
       <w:r>
@@ -10902,7 +10562,9 @@
                     </pic:cNvPicPr>
                   </pic:nvPicPr>
                   <pic:blipFill>
-                    <a:blip r:embed="rId30"/>
+                    <a:blip r:embed="rId30">
+                      <a:lum bright="-6000"/>
+                    </a:blip>
                     <a:stretch>
                       <a:fillRect/>
                     </a:stretch>
@@ -10935,158 +10597,884 @@
         <w:keepLines w:val="0"/>
         <w:widowControl/>
         <w:suppressLineNumbers w:val="0"/>
+        <w:spacing w:beforeAutospacing="0" w:line="150" w:lineRule="atLeast"/>
         <w:jc w:val="left"/>
+        <w:rPr>
+          <w:rFonts w:hint="eastAsia" w:ascii="Calibri" w:hAnsi="Calibri" w:cs="Calibri"/>
+          <w:b/>
+          <w:bCs/>
+          <w:sz w:val="24"/>
+          <w:szCs w:val="24"/>
+          <w:lang w:eastAsia="zh-CN"/>
+        </w:rPr>
+      </w:pPr>
+      <w:r>
+        <w:rPr>
+          <w:rFonts w:hint="eastAsia" w:ascii="Calibri" w:hAnsi="Calibri" w:cs="Calibri"/>
+          <w:b/>
+          <w:bCs/>
+          <w:sz w:val="24"/>
+          <w:szCs w:val="24"/>
+          <w:lang w:eastAsia="zh-CN"/>
+        </w:rPr>
+        <w:t>————————————————————————————————</w:t>
+      </w:r>
+    </w:p>
+    <w:p>
+      <w:pPr>
+        <w:pStyle w:val="12"/>
+        <w:keepNext w:val="0"/>
+        <w:keepLines w:val="0"/>
+        <w:widowControl/>
+        <w:numPr>
+          <w:ilvl w:val="0"/>
+          <w:numId w:val="2"/>
+        </w:numPr>
+        <w:suppressLineNumbers w:val="0"/>
+        <w:ind w:left="425" w:leftChars="0" w:hanging="425" w:firstLineChars="0"/>
+        <w:jc w:val="center"/>
+        <w:rPr>
+          <w:rFonts w:hint="eastAsia" w:ascii="Calibri" w:hAnsi="Calibri" w:cs="Calibri"/>
+          <w:b/>
+          <w:bCs/>
+          <w:sz w:val="24"/>
+          <w:szCs w:val="24"/>
+          <w:vertAlign w:val="baseline"/>
+          <w:lang w:val="en-US" w:eastAsia="zh-CN"/>
+        </w:rPr>
+      </w:pPr>
+    </w:p>
+    <w:p>
+      <w:pPr>
+        <w:keepNext w:val="0"/>
+        <w:keepLines w:val="0"/>
+        <w:widowControl/>
+        <w:suppressLineNumbers w:val="0"/>
+        <w:pBdr>
+          <w:top w:val="none" w:color="auto" w:sz="0" w:space="0"/>
+          <w:left w:val="none" w:color="auto" w:sz="0" w:space="0"/>
+          <w:bottom w:val="none" w:color="auto" w:sz="0" w:space="0"/>
+          <w:right w:val="none" w:color="auto" w:sz="0" w:space="0"/>
+        </w:pBdr>
+        <w:shd w:val="clear" w:fill="FFFFFF"/>
+        <w:bidi w:val="0"/>
+        <w:spacing w:before="0" w:beforeAutospacing="0" w:after="0" w:afterAutospacing="0"/>
+        <w:ind w:left="0" w:right="0" w:firstLine="0"/>
+        <w:jc w:val="left"/>
+        <w:textAlignment w:val="baseline"/>
+        <w:rPr>
+          <w:rFonts w:hint="default" w:ascii="Calibri" w:hAnsi="Calibri" w:cs="Calibri"/>
+          <w:b/>
+          <w:bCs/>
+          <w:color w:val="FF0000"/>
+          <w:sz w:val="24"/>
+          <w:szCs w:val="24"/>
+          <w:lang w:val="en-US" w:eastAsia="zh-CN"/>
+        </w:rPr>
+      </w:pPr>
+      <w:r>
+        <w:rPr>
+          <w:rFonts w:hint="default" w:ascii="Calibri" w:hAnsi="Calibri" w:cs="Calibri"/>
+          <w:b/>
+          <w:bCs/>
+          <w:color w:val="FF0000"/>
+          <w:sz w:val="24"/>
+          <w:szCs w:val="24"/>
+          <w:lang w:val="en-US" w:eastAsia="zh-CN"/>
+        </w:rPr>
+        <w:t>Q: “</w:t>
+      </w:r>
+      <w:r>
+        <w:rPr>
+          <w:rFonts w:hint="default" w:ascii="Calibri" w:hAnsi="Calibri" w:eastAsia="Arial" w:cs="Calibri"/>
+          <w:b/>
+          <w:bCs/>
+          <w:i w:val="0"/>
+          <w:iCs w:val="0"/>
+          <w:caps w:val="0"/>
+          <w:color w:val="FF0000"/>
+          <w:spacing w:val="0"/>
+          <w:kern w:val="0"/>
+          <w:sz w:val="24"/>
+          <w:szCs w:val="24"/>
+          <w:shd w:val="clear" w:fill="FFFFFF"/>
+          <w:vertAlign w:val="baseline"/>
+          <w:lang w:val="en-US" w:eastAsia="zh-CN" w:bidi="ar"/>
+        </w:rPr>
+        <w:t>What’s the next step with this?”</w:t>
+      </w:r>
+    </w:p>
+    <w:p>
+      <w:pPr>
+        <w:keepNext w:val="0"/>
+        <w:keepLines w:val="0"/>
+        <w:widowControl/>
+        <w:suppressLineNumbers w:val="0"/>
+        <w:spacing w:before="163" w:beforeLines="52" w:beforeAutospacing="0" w:line="150" w:lineRule="atLeast"/>
+        <w:jc w:val="left"/>
+        <w:rPr>
+          <w:rFonts w:hint="default" w:ascii="Calibri" w:hAnsi="Calibri" w:cs="Calibri"/>
+          <w:b/>
+          <w:bCs/>
+          <w:color w:val="0000FF"/>
+          <w:sz w:val="24"/>
+          <w:szCs w:val="24"/>
+          <w:lang w:eastAsia="zh-CN"/>
+        </w:rPr>
+      </w:pPr>
+      <w:r>
+        <w:rPr>
+          <w:rFonts w:hint="eastAsia" w:ascii="Calibri" w:hAnsi="Calibri" w:cs="Calibri"/>
+          <w:b/>
+          <w:bCs/>
+          <w:color w:val="0000FF"/>
+          <w:sz w:val="24"/>
+          <w:szCs w:val="24"/>
+          <w:lang w:val="en-US" w:eastAsia="zh-CN"/>
+        </w:rPr>
+        <w:t xml:space="preserve">A: </w:t>
+      </w:r>
+      <w:r>
+        <w:rPr>
+          <w:rFonts w:hint="default" w:ascii="Calibri" w:hAnsi="Calibri" w:cs="Calibri"/>
+          <w:b/>
+          <w:bCs/>
+          <w:color w:val="0000FF"/>
+          <w:sz w:val="24"/>
+          <w:szCs w:val="24"/>
+          <w:lang w:val="en-US" w:eastAsia="zh-CN"/>
+        </w:rPr>
+        <w:t>“</w:t>
+      </w:r>
+      <w:r>
+        <w:rPr>
+          <w:rFonts w:hint="default" w:ascii="Calibri" w:hAnsi="Calibri" w:cs="Calibri"/>
+          <w:b w:val="0"/>
+          <w:bCs w:val="0"/>
+          <w:color w:val="0000FF"/>
+          <w:sz w:val="24"/>
+          <w:szCs w:val="24"/>
+          <w:lang w:eastAsia="zh-CN"/>
+        </w:rPr>
+        <w:t>I plan to revise the documents, produce additional versions in other languages, streamline the arguments, and possibly create a video format to communicate the core ideas more clearly in the future when I have time.</w:t>
+      </w:r>
+    </w:p>
+    <w:p>
+      <w:pPr>
+        <w:keepNext w:val="0"/>
+        <w:keepLines w:val="0"/>
+        <w:widowControl/>
+        <w:suppressLineNumbers w:val="0"/>
+        <w:spacing w:beforeAutospacing="0" w:line="150" w:lineRule="atLeast"/>
+        <w:jc w:val="left"/>
+        <w:rPr>
+          <w:rFonts w:hint="default" w:ascii="Calibri" w:hAnsi="Calibri" w:cs="Calibri"/>
+          <w:b/>
+          <w:bCs/>
+          <w:color w:val="0000FF"/>
+          <w:sz w:val="24"/>
+          <w:szCs w:val="24"/>
+          <w:lang w:eastAsia="zh-CN"/>
+        </w:rPr>
       </w:pPr>
       <w:bookmarkStart w:id="0" w:name="_GoBack"/>
       <w:bookmarkEnd w:id="0"/>
     </w:p>
     <w:p>
       <w:pPr>
-        <w:keepNext w:val="0"/>
-        <w:keepLines w:val="0"/>
-        <w:widowControl/>
-        <w:suppressLineNumbers w:val="0"/>
+        <w:pStyle w:val="12"/>
+        <w:keepNext w:val="0"/>
+        <w:keepLines w:val="0"/>
+        <w:widowControl/>
+        <w:suppressLineNumbers w:val="0"/>
+        <w:rPr>
+          <w:rFonts w:hint="default"/>
+          <w:b/>
+          <w:bCs/>
+          <w:color w:val="0000FF"/>
+          <w:lang w:val="en-US" w:eastAsia="zh-CN"/>
+        </w:rPr>
+      </w:pPr>
+      <w:r>
+        <w:rPr>
+          <w:rFonts w:hint="default" w:ascii="Calibri" w:hAnsi="Calibri" w:cs="Calibri"/>
+          <w:b w:val="0"/>
+          <w:bCs w:val="0"/>
+          <w:color w:val="0000FF"/>
+          <w:sz w:val="24"/>
+          <w:szCs w:val="24"/>
+          <w:lang w:eastAsia="zh-CN"/>
+        </w:rPr>
+        <w:t>In addition,</w:t>
+      </w:r>
+      <w:r>
+        <w:rPr>
+          <w:rFonts w:hint="default" w:ascii="Calibri" w:hAnsi="Calibri" w:cs="Calibri"/>
+          <w:b/>
+          <w:bCs/>
+          <w:color w:val="0000FF"/>
+          <w:sz w:val="24"/>
+          <w:szCs w:val="24"/>
+          <w:lang w:eastAsia="zh-CN"/>
+        </w:rPr>
+        <w:t xml:space="preserve"> </w:t>
+      </w:r>
+      <w:r>
+        <w:rPr>
+          <w:rFonts w:hint="default" w:ascii="Calibri" w:hAnsi="Calibri" w:cs="Calibri"/>
+          <w:b w:val="0"/>
+          <w:bCs w:val="0"/>
+          <w:color w:val="0000FF"/>
+          <w:sz w:val="24"/>
+          <w:szCs w:val="24"/>
+          <w:lang w:eastAsia="zh-CN"/>
+        </w:rPr>
+        <w:t>I believe this project could</w:t>
+      </w:r>
+      <w:r>
+        <w:rPr>
+          <w:rFonts w:hint="eastAsia" w:ascii="Calibri" w:hAnsi="Calibri" w:cs="Calibri"/>
+          <w:b w:val="0"/>
+          <w:bCs w:val="0"/>
+          <w:color w:val="0000FF"/>
+          <w:sz w:val="24"/>
+          <w:szCs w:val="24"/>
+          <w:lang w:val="en-US" w:eastAsia="zh-CN"/>
+        </w:rPr>
+        <w:t xml:space="preserve"> </w:t>
+      </w:r>
+      <w:r>
+        <w:rPr>
+          <w:rFonts w:hint="default" w:ascii="Calibri" w:hAnsi="Calibri" w:cs="Calibri"/>
+          <w:b w:val="0"/>
+          <w:bCs w:val="0"/>
+          <w:color w:val="0000FF"/>
+          <w:sz w:val="24"/>
+          <w:szCs w:val="24"/>
+          <w:lang w:eastAsia="zh-CN"/>
+        </w:rPr>
+        <w:t xml:space="preserve">serve as a meaningful thesis direction for undergraduate students in </w:t>
+      </w:r>
+      <w:r>
+        <w:rPr>
+          <w:rFonts w:hint="default" w:ascii="Calibri" w:hAnsi="Calibri" w:cs="Calibri"/>
+          <w:b/>
+          <w:bCs/>
+          <w:color w:val="0000FF"/>
+          <w:sz w:val="24"/>
+          <w:szCs w:val="24"/>
+          <w:lang w:eastAsia="zh-CN"/>
+        </w:rPr>
+        <w:t xml:space="preserve">linguistics, standardization engineering, and other related fields. </w:t>
+      </w:r>
+      <w:r>
+        <w:rPr>
+          <w:rFonts w:hint="default" w:ascii="Calibri" w:hAnsi="Calibri" w:cs="Calibri"/>
+          <w:b w:val="0"/>
+          <w:bCs w:val="0"/>
+          <w:color w:val="0000FF"/>
+          <w:sz w:val="24"/>
+          <w:szCs w:val="24"/>
+          <w:lang w:eastAsia="zh-CN"/>
+        </w:rPr>
+        <w:t xml:space="preserve">Beyond my own efforts to share the project on social media, </w:t>
+      </w:r>
+      <w:r>
+        <w:rPr>
+          <w:rFonts w:hint="default" w:ascii="Calibri" w:hAnsi="Calibri" w:cs="Calibri"/>
+          <w:b/>
+          <w:bCs/>
+          <w:color w:val="0000FF"/>
+          <w:sz w:val="24"/>
+          <w:szCs w:val="24"/>
+          <w:lang w:eastAsia="zh-CN"/>
+        </w:rPr>
+        <w:t xml:space="preserve">enabling students to use UMBL as a basis for their academic work </w:t>
+      </w:r>
+      <w:r>
+        <w:rPr>
+          <w:rFonts w:hint="default" w:ascii="Calibri" w:hAnsi="Calibri" w:cs="Calibri"/>
+          <w:b w:val="0"/>
+          <w:bCs w:val="0"/>
+          <w:color w:val="0000FF"/>
+          <w:sz w:val="24"/>
+          <w:szCs w:val="24"/>
+          <w:lang w:eastAsia="zh-CN"/>
+        </w:rPr>
+        <w:t xml:space="preserve">may be the most effective and grounded way for the project to enter </w:t>
+      </w:r>
+      <w:r>
+        <w:rPr>
+          <w:rFonts w:hint="default" w:ascii="Calibri" w:hAnsi="Calibri" w:cs="Calibri"/>
+          <w:b/>
+          <w:bCs/>
+          <w:color w:val="0000FF"/>
+          <w:sz w:val="24"/>
+          <w:szCs w:val="24"/>
+          <w:lang w:eastAsia="zh-CN"/>
+        </w:rPr>
+        <w:t>academic discourse</w:t>
+      </w:r>
+      <w:r>
+        <w:rPr>
+          <w:rFonts w:hint="default" w:ascii="Calibri" w:hAnsi="Calibri" w:cs="Calibri"/>
+          <w:b w:val="0"/>
+          <w:bCs w:val="0"/>
+          <w:color w:val="0000FF"/>
+          <w:sz w:val="24"/>
+          <w:szCs w:val="24"/>
+          <w:lang w:eastAsia="zh-CN"/>
+        </w:rPr>
+        <w:t xml:space="preserve"> and gradually spread within the </w:t>
+      </w:r>
+      <w:r>
+        <w:rPr>
+          <w:rFonts w:hint="default" w:ascii="Calibri" w:hAnsi="Calibri" w:cs="Calibri"/>
+          <w:b/>
+          <w:bCs/>
+          <w:color w:val="0000FF"/>
+          <w:sz w:val="24"/>
+          <w:szCs w:val="24"/>
+          <w:lang w:eastAsia="zh-CN"/>
+        </w:rPr>
+        <w:t>scholarly community.</w:t>
+      </w:r>
+      <w:r>
+        <w:rPr>
+          <w:rFonts w:hint="default"/>
+          <w:b/>
+          <w:bCs/>
+          <w:color w:val="0000FF"/>
+          <w:lang w:val="en-US" w:eastAsia="zh-CN"/>
+        </w:rPr>
+        <w:t>”</w:t>
+      </w:r>
+    </w:p>
+    <w:p>
+      <w:pPr>
+        <w:keepNext w:val="0"/>
+        <w:keepLines w:val="0"/>
+        <w:widowControl/>
+        <w:suppressLineNumbers w:val="0"/>
+        <w:spacing w:beforeAutospacing="0" w:line="150" w:lineRule="atLeast"/>
         <w:jc w:val="left"/>
-      </w:pPr>
-    </w:p>
-    <w:p>
-      <w:pPr>
-        <w:keepNext w:val="0"/>
-        <w:keepLines w:val="0"/>
-        <w:widowControl/>
-        <w:suppressLineNumbers w:val="0"/>
+        <w:rPr>
+          <w:rFonts w:hint="default" w:ascii="Calibri" w:hAnsi="Calibri" w:cs="Calibri"/>
+          <w:b/>
+          <w:bCs/>
+          <w:sz w:val="24"/>
+          <w:szCs w:val="24"/>
+          <w:lang w:eastAsia="zh-CN"/>
+        </w:rPr>
+      </w:pPr>
+      <w:r>
+        <w:rPr>
+          <w:rFonts w:hint="eastAsia" w:ascii="Calibri" w:hAnsi="Calibri" w:cs="Calibri"/>
+          <w:b/>
+          <w:bCs/>
+          <w:sz w:val="24"/>
+          <w:szCs w:val="24"/>
+          <w:lang w:eastAsia="zh-CN"/>
+        </w:rPr>
+        <w:t>————————————————————————————————</w:t>
+      </w:r>
+    </w:p>
+    <w:p>
+      <w:pPr>
+        <w:keepNext w:val="0"/>
+        <w:keepLines w:val="0"/>
+        <w:widowControl/>
+        <w:suppressLineNumbers w:val="0"/>
+        <w:spacing w:beforeAutospacing="0" w:line="150" w:lineRule="atLeast"/>
         <w:jc w:val="left"/>
-      </w:pPr>
-    </w:p>
-    <w:p>
-      <w:pPr>
-        <w:keepNext w:val="0"/>
-        <w:keepLines w:val="0"/>
-        <w:widowControl/>
-        <w:suppressLineNumbers w:val="0"/>
+        <w:rPr>
+          <w:rFonts w:hint="default" w:ascii="Calibri" w:hAnsi="Calibri" w:cs="Calibri"/>
+          <w:b/>
+          <w:bCs/>
+          <w:sz w:val="24"/>
+          <w:szCs w:val="24"/>
+          <w:lang w:eastAsia="zh-CN"/>
+        </w:rPr>
+      </w:pPr>
+    </w:p>
+    <w:p>
+      <w:pPr>
+        <w:keepNext w:val="0"/>
+        <w:keepLines w:val="0"/>
+        <w:widowControl/>
+        <w:suppressLineNumbers w:val="0"/>
+        <w:spacing w:beforeAutospacing="0" w:line="150" w:lineRule="atLeast"/>
         <w:jc w:val="left"/>
-      </w:pPr>
-    </w:p>
-    <w:p>
-      <w:pPr>
-        <w:keepNext w:val="0"/>
-        <w:keepLines w:val="0"/>
-        <w:widowControl/>
-        <w:suppressLineNumbers w:val="0"/>
+        <w:rPr>
+          <w:rFonts w:hint="default" w:ascii="Calibri" w:hAnsi="Calibri" w:cs="Calibri"/>
+          <w:b/>
+          <w:bCs/>
+          <w:sz w:val="24"/>
+          <w:szCs w:val="24"/>
+          <w:lang w:eastAsia="zh-CN"/>
+        </w:rPr>
+      </w:pPr>
+    </w:p>
+    <w:p>
+      <w:pPr>
+        <w:keepNext w:val="0"/>
+        <w:keepLines w:val="0"/>
+        <w:widowControl/>
+        <w:suppressLineNumbers w:val="0"/>
+        <w:spacing w:beforeAutospacing="0" w:line="150" w:lineRule="atLeast"/>
         <w:jc w:val="left"/>
-      </w:pPr>
-    </w:p>
-    <w:p>
-      <w:pPr>
-        <w:keepNext w:val="0"/>
-        <w:keepLines w:val="0"/>
-        <w:widowControl/>
-        <w:suppressLineNumbers w:val="0"/>
+        <w:rPr>
+          <w:rFonts w:hint="default" w:ascii="Calibri" w:hAnsi="Calibri" w:cs="Calibri"/>
+          <w:b/>
+          <w:bCs/>
+          <w:sz w:val="24"/>
+          <w:szCs w:val="24"/>
+          <w:lang w:eastAsia="zh-CN"/>
+        </w:rPr>
+      </w:pPr>
+    </w:p>
+    <w:p>
+      <w:pPr>
+        <w:keepNext w:val="0"/>
+        <w:keepLines w:val="0"/>
+        <w:widowControl/>
+        <w:suppressLineNumbers w:val="0"/>
+        <w:spacing w:beforeAutospacing="0" w:line="150" w:lineRule="atLeast"/>
         <w:jc w:val="left"/>
-      </w:pPr>
-    </w:p>
-    <w:p>
-      <w:pPr>
-        <w:keepNext w:val="0"/>
-        <w:keepLines w:val="0"/>
-        <w:widowControl/>
-        <w:suppressLineNumbers w:val="0"/>
+        <w:rPr>
+          <w:rFonts w:hint="default" w:ascii="Calibri" w:hAnsi="Calibri" w:cs="Calibri"/>
+          <w:b/>
+          <w:bCs/>
+          <w:sz w:val="24"/>
+          <w:szCs w:val="24"/>
+          <w:lang w:eastAsia="zh-CN"/>
+        </w:rPr>
+      </w:pPr>
+    </w:p>
+    <w:p>
+      <w:pPr>
+        <w:keepNext w:val="0"/>
+        <w:keepLines w:val="0"/>
+        <w:widowControl/>
+        <w:suppressLineNumbers w:val="0"/>
+        <w:spacing w:beforeAutospacing="0" w:line="150" w:lineRule="atLeast"/>
         <w:jc w:val="left"/>
-      </w:pPr>
-    </w:p>
-    <w:p>
-      <w:pPr>
-        <w:keepNext w:val="0"/>
-        <w:keepLines w:val="0"/>
-        <w:widowControl/>
-        <w:suppressLineNumbers w:val="0"/>
+        <w:rPr>
+          <w:rFonts w:hint="default" w:ascii="Calibri" w:hAnsi="Calibri" w:cs="Calibri"/>
+          <w:b/>
+          <w:bCs/>
+          <w:sz w:val="24"/>
+          <w:szCs w:val="24"/>
+          <w:lang w:eastAsia="zh-CN"/>
+        </w:rPr>
+      </w:pPr>
+    </w:p>
+    <w:p>
+      <w:pPr>
+        <w:keepNext w:val="0"/>
+        <w:keepLines w:val="0"/>
+        <w:widowControl/>
+        <w:suppressLineNumbers w:val="0"/>
+        <w:spacing w:beforeAutospacing="0" w:line="150" w:lineRule="atLeast"/>
         <w:jc w:val="left"/>
-      </w:pPr>
-    </w:p>
-    <w:p>
-      <w:pPr>
-        <w:keepNext w:val="0"/>
-        <w:keepLines w:val="0"/>
-        <w:widowControl/>
-        <w:suppressLineNumbers w:val="0"/>
+        <w:rPr>
+          <w:rFonts w:hint="default" w:ascii="Calibri" w:hAnsi="Calibri" w:cs="Calibri"/>
+          <w:b/>
+          <w:bCs/>
+          <w:sz w:val="24"/>
+          <w:szCs w:val="24"/>
+          <w:lang w:eastAsia="zh-CN"/>
+        </w:rPr>
+      </w:pPr>
+    </w:p>
+    <w:p>
+      <w:pPr>
+        <w:keepNext w:val="0"/>
+        <w:keepLines w:val="0"/>
+        <w:widowControl/>
+        <w:suppressLineNumbers w:val="0"/>
+        <w:spacing w:beforeAutospacing="0" w:line="150" w:lineRule="atLeast"/>
         <w:jc w:val="left"/>
-      </w:pPr>
-    </w:p>
-    <w:p>
-      <w:pPr>
-        <w:keepNext w:val="0"/>
-        <w:keepLines w:val="0"/>
-        <w:widowControl/>
-        <w:suppressLineNumbers w:val="0"/>
+        <w:rPr>
+          <w:rFonts w:hint="default" w:ascii="Calibri" w:hAnsi="Calibri" w:cs="Calibri"/>
+          <w:b/>
+          <w:bCs/>
+          <w:sz w:val="24"/>
+          <w:szCs w:val="24"/>
+          <w:lang w:eastAsia="zh-CN"/>
+        </w:rPr>
+      </w:pPr>
+    </w:p>
+    <w:p>
+      <w:pPr>
+        <w:keepNext w:val="0"/>
+        <w:keepLines w:val="0"/>
+        <w:widowControl/>
+        <w:suppressLineNumbers w:val="0"/>
+        <w:spacing w:beforeAutospacing="0" w:line="150" w:lineRule="atLeast"/>
         <w:jc w:val="left"/>
-      </w:pPr>
-    </w:p>
-    <w:p>
-      <w:pPr>
-        <w:keepNext w:val="0"/>
-        <w:keepLines w:val="0"/>
-        <w:widowControl/>
-        <w:suppressLineNumbers w:val="0"/>
+        <w:rPr>
+          <w:rFonts w:hint="default" w:ascii="Calibri" w:hAnsi="Calibri" w:cs="Calibri"/>
+          <w:b/>
+          <w:bCs/>
+          <w:sz w:val="24"/>
+          <w:szCs w:val="24"/>
+          <w:lang w:eastAsia="zh-CN"/>
+        </w:rPr>
+      </w:pPr>
+    </w:p>
+    <w:p>
+      <w:pPr>
+        <w:keepNext w:val="0"/>
+        <w:keepLines w:val="0"/>
+        <w:widowControl/>
+        <w:suppressLineNumbers w:val="0"/>
+        <w:spacing w:beforeAutospacing="0" w:line="150" w:lineRule="atLeast"/>
         <w:jc w:val="left"/>
-      </w:pPr>
-    </w:p>
-    <w:p>
-      <w:pPr>
-        <w:keepNext w:val="0"/>
-        <w:keepLines w:val="0"/>
-        <w:widowControl/>
-        <w:suppressLineNumbers w:val="0"/>
+        <w:rPr>
+          <w:rFonts w:hint="default" w:ascii="Calibri" w:hAnsi="Calibri" w:cs="Calibri"/>
+          <w:b/>
+          <w:bCs/>
+          <w:sz w:val="24"/>
+          <w:szCs w:val="24"/>
+          <w:lang w:eastAsia="zh-CN"/>
+        </w:rPr>
+      </w:pPr>
+    </w:p>
+    <w:p>
+      <w:pPr>
+        <w:keepNext w:val="0"/>
+        <w:keepLines w:val="0"/>
+        <w:widowControl/>
+        <w:suppressLineNumbers w:val="0"/>
+        <w:spacing w:beforeAutospacing="0" w:line="150" w:lineRule="atLeast"/>
         <w:jc w:val="left"/>
-      </w:pPr>
-    </w:p>
-    <w:p>
-      <w:pPr>
-        <w:keepNext w:val="0"/>
-        <w:keepLines w:val="0"/>
-        <w:widowControl/>
-        <w:suppressLineNumbers w:val="0"/>
+        <w:rPr>
+          <w:rFonts w:hint="default" w:ascii="Calibri" w:hAnsi="Calibri" w:cs="Calibri"/>
+          <w:b/>
+          <w:bCs/>
+          <w:sz w:val="24"/>
+          <w:szCs w:val="24"/>
+          <w:lang w:eastAsia="zh-CN"/>
+        </w:rPr>
+      </w:pPr>
+    </w:p>
+    <w:p>
+      <w:pPr>
+        <w:keepNext w:val="0"/>
+        <w:keepLines w:val="0"/>
+        <w:widowControl/>
+        <w:suppressLineNumbers w:val="0"/>
+        <w:spacing w:beforeAutospacing="0" w:line="150" w:lineRule="atLeast"/>
         <w:jc w:val="left"/>
-      </w:pPr>
-    </w:p>
-    <w:p>
-      <w:pPr>
-        <w:keepNext w:val="0"/>
-        <w:keepLines w:val="0"/>
-        <w:widowControl/>
-        <w:suppressLineNumbers w:val="0"/>
+        <w:rPr>
+          <w:rFonts w:hint="default" w:ascii="Calibri" w:hAnsi="Calibri" w:cs="Calibri"/>
+          <w:b/>
+          <w:bCs/>
+          <w:sz w:val="24"/>
+          <w:szCs w:val="24"/>
+          <w:lang w:eastAsia="zh-CN"/>
+        </w:rPr>
+      </w:pPr>
+    </w:p>
+    <w:p>
+      <w:pPr>
+        <w:keepNext w:val="0"/>
+        <w:keepLines w:val="0"/>
+        <w:widowControl/>
+        <w:suppressLineNumbers w:val="0"/>
+        <w:spacing w:beforeAutospacing="0" w:line="150" w:lineRule="atLeast"/>
         <w:jc w:val="left"/>
-      </w:pPr>
-    </w:p>
-    <w:p>
-      <w:pPr>
-        <w:keepNext w:val="0"/>
-        <w:keepLines w:val="0"/>
-        <w:widowControl/>
-        <w:suppressLineNumbers w:val="0"/>
+        <w:rPr>
+          <w:rFonts w:hint="default" w:ascii="Calibri" w:hAnsi="Calibri" w:cs="Calibri"/>
+          <w:b/>
+          <w:bCs/>
+          <w:sz w:val="24"/>
+          <w:szCs w:val="24"/>
+          <w:lang w:eastAsia="zh-CN"/>
+        </w:rPr>
+      </w:pPr>
+    </w:p>
+    <w:p>
+      <w:pPr>
+        <w:keepNext w:val="0"/>
+        <w:keepLines w:val="0"/>
+        <w:widowControl/>
+        <w:suppressLineNumbers w:val="0"/>
+        <w:spacing w:beforeAutospacing="0" w:line="150" w:lineRule="atLeast"/>
         <w:jc w:val="left"/>
-      </w:pPr>
-    </w:p>
-    <w:p>
-      <w:pPr>
-        <w:keepNext w:val="0"/>
-        <w:keepLines w:val="0"/>
-        <w:widowControl/>
-        <w:suppressLineNumbers w:val="0"/>
+        <w:rPr>
+          <w:rFonts w:hint="default" w:ascii="Calibri" w:hAnsi="Calibri" w:cs="Calibri"/>
+          <w:b/>
+          <w:bCs/>
+          <w:sz w:val="24"/>
+          <w:szCs w:val="24"/>
+          <w:lang w:eastAsia="zh-CN"/>
+        </w:rPr>
+      </w:pPr>
+    </w:p>
+    <w:p>
+      <w:pPr>
+        <w:keepNext w:val="0"/>
+        <w:keepLines w:val="0"/>
+        <w:widowControl/>
+        <w:suppressLineNumbers w:val="0"/>
+        <w:spacing w:beforeAutospacing="0" w:line="150" w:lineRule="atLeast"/>
         <w:jc w:val="left"/>
-      </w:pPr>
-    </w:p>
-    <w:p>
-      <w:pPr>
-        <w:keepNext w:val="0"/>
-        <w:keepLines w:val="0"/>
-        <w:widowControl/>
-        <w:suppressLineNumbers w:val="0"/>
+        <w:rPr>
+          <w:rFonts w:hint="default" w:ascii="Calibri" w:hAnsi="Calibri" w:cs="Calibri"/>
+          <w:b/>
+          <w:bCs/>
+          <w:sz w:val="24"/>
+          <w:szCs w:val="24"/>
+          <w:lang w:eastAsia="zh-CN"/>
+        </w:rPr>
+      </w:pPr>
+    </w:p>
+    <w:p>
+      <w:pPr>
+        <w:keepNext w:val="0"/>
+        <w:keepLines w:val="0"/>
+        <w:widowControl/>
+        <w:suppressLineNumbers w:val="0"/>
+        <w:spacing w:beforeAutospacing="0" w:line="150" w:lineRule="atLeast"/>
         <w:jc w:val="left"/>
         <w:rPr>
-          <w:rFonts w:hint="default"/>
-          <w:lang w:val="en-US" w:eastAsia="zh-CN"/>
-        </w:rPr>
-      </w:pPr>
+          <w:rFonts w:hint="default" w:ascii="Calibri" w:hAnsi="Calibri" w:cs="Calibri"/>
+          <w:b/>
+          <w:bCs/>
+          <w:sz w:val="24"/>
+          <w:szCs w:val="24"/>
+          <w:lang w:eastAsia="zh-CN"/>
+        </w:rPr>
+      </w:pPr>
+    </w:p>
+    <w:p>
+      <w:pPr>
+        <w:keepNext w:val="0"/>
+        <w:keepLines w:val="0"/>
+        <w:widowControl/>
+        <w:suppressLineNumbers w:val="0"/>
+        <w:spacing w:beforeAutospacing="0" w:line="150" w:lineRule="atLeast"/>
+        <w:jc w:val="left"/>
+        <w:rPr>
+          <w:rFonts w:hint="default" w:ascii="Calibri" w:hAnsi="Calibri" w:cs="Calibri"/>
+          <w:b/>
+          <w:bCs/>
+          <w:sz w:val="24"/>
+          <w:szCs w:val="24"/>
+          <w:lang w:eastAsia="zh-CN"/>
+        </w:rPr>
+      </w:pPr>
+    </w:p>
+    <w:p>
+      <w:pPr>
+        <w:keepNext w:val="0"/>
+        <w:keepLines w:val="0"/>
+        <w:widowControl/>
+        <w:suppressLineNumbers w:val="0"/>
+        <w:spacing w:beforeAutospacing="0" w:line="150" w:lineRule="atLeast"/>
+        <w:jc w:val="left"/>
+        <w:rPr>
+          <w:rFonts w:hint="default" w:ascii="Calibri" w:hAnsi="Calibri" w:cs="Calibri"/>
+          <w:b/>
+          <w:bCs/>
+          <w:sz w:val="24"/>
+          <w:szCs w:val="24"/>
+          <w:lang w:eastAsia="zh-CN"/>
+        </w:rPr>
+      </w:pPr>
+    </w:p>
+    <w:p>
+      <w:pPr>
+        <w:keepNext w:val="0"/>
+        <w:keepLines w:val="0"/>
+        <w:widowControl/>
+        <w:suppressLineNumbers w:val="0"/>
+        <w:spacing w:beforeAutospacing="0" w:line="150" w:lineRule="atLeast"/>
+        <w:jc w:val="left"/>
+        <w:rPr>
+          <w:rFonts w:hint="default" w:ascii="Calibri" w:hAnsi="Calibri" w:cs="Calibri"/>
+          <w:b/>
+          <w:bCs/>
+          <w:sz w:val="24"/>
+          <w:szCs w:val="24"/>
+          <w:lang w:eastAsia="zh-CN"/>
+        </w:rPr>
+      </w:pPr>
+    </w:p>
+    <w:p>
+      <w:pPr>
+        <w:keepNext w:val="0"/>
+        <w:keepLines w:val="0"/>
+        <w:widowControl/>
+        <w:numPr>
+          <w:ilvl w:val="0"/>
+          <w:numId w:val="2"/>
+        </w:numPr>
+        <w:suppressLineNumbers w:val="0"/>
+        <w:spacing w:beforeAutospacing="0" w:line="150" w:lineRule="atLeast"/>
+        <w:ind w:left="425" w:leftChars="0" w:hanging="425" w:firstLineChars="0"/>
+        <w:jc w:val="center"/>
+        <w:rPr>
+          <w:rFonts w:hint="default" w:ascii="Calibri" w:hAnsi="Calibri" w:eastAsia="宋体" w:cs="Calibri"/>
+          <w:b/>
+          <w:bCs/>
+          <w:color w:val="FF0000"/>
+          <w:kern w:val="2"/>
+          <w:sz w:val="24"/>
+          <w:szCs w:val="24"/>
+        </w:rPr>
+      </w:pPr>
+    </w:p>
+    <w:p>
+      <w:pPr>
+        <w:keepNext w:val="0"/>
+        <w:keepLines w:val="0"/>
+        <w:widowControl/>
+        <w:suppressLineNumbers w:val="0"/>
+        <w:spacing w:line="150" w:lineRule="atLeast"/>
+        <w:jc w:val="left"/>
+        <w:rPr>
+          <w:rFonts w:hint="eastAsia" w:ascii="Calibri" w:hAnsi="Calibri" w:eastAsia="宋体" w:cs="Calibri"/>
+          <w:b/>
+          <w:bCs/>
+          <w:color w:val="FF0000"/>
+          <w:kern w:val="2"/>
+          <w:sz w:val="24"/>
+          <w:szCs w:val="24"/>
+          <w:lang w:val="en-US" w:eastAsia="zh-CN"/>
+        </w:rPr>
+      </w:pPr>
+      <w:r>
+        <w:rPr>
+          <w:rFonts w:hint="default" w:ascii="Calibri" w:hAnsi="Calibri" w:eastAsia="宋体" w:cs="Calibri"/>
+          <w:b/>
+          <w:bCs/>
+          <w:color w:val="FF0000"/>
+          <w:kern w:val="2"/>
+          <w:sz w:val="24"/>
+          <w:szCs w:val="24"/>
+        </w:rPr>
+        <w:t>Q: “</w:t>
+      </w:r>
+      <w:r>
+        <w:rPr>
+          <w:rFonts w:hint="default" w:ascii="Calibri" w:hAnsi="Calibri" w:eastAsia="宋体" w:cs="Calibri"/>
+          <w:b/>
+          <w:bCs/>
+          <w:color w:val="FF0000"/>
+          <w:kern w:val="2"/>
+          <w:sz w:val="24"/>
+          <w:szCs w:val="24"/>
+          <w:lang w:val="en-US" w:eastAsia="zh-CN"/>
+        </w:rPr>
+        <w:t>”</w:t>
+      </w:r>
+    </w:p>
+    <w:p>
+      <w:pPr>
+        <w:pStyle w:val="12"/>
+        <w:keepNext w:val="0"/>
+        <w:keepLines w:val="0"/>
+        <w:widowControl/>
+        <w:suppressLineNumbers w:val="0"/>
+        <w:spacing w:line="150" w:lineRule="atLeast"/>
+        <w:rPr>
+          <w:rFonts w:hint="default" w:ascii="Calibri" w:hAnsi="Calibri" w:eastAsia="宋体" w:cs="Calibri"/>
+          <w:b/>
+          <w:bCs w:val="0"/>
+          <w:color w:val="0000FF"/>
+          <w:kern w:val="2"/>
+          <w:sz w:val="24"/>
+          <w:szCs w:val="24"/>
+          <w:lang w:val="en-US" w:eastAsia="zh-CN"/>
+        </w:rPr>
+      </w:pPr>
+      <w:r>
+        <w:rPr>
+          <w:rFonts w:hint="default" w:ascii="Calibri" w:hAnsi="Calibri" w:eastAsia="宋体" w:cs="Calibri"/>
+          <w:b/>
+          <w:bCs w:val="0"/>
+          <w:color w:val="0000FF"/>
+          <w:kern w:val="2"/>
+          <w:sz w:val="24"/>
+          <w:szCs w:val="24"/>
+        </w:rPr>
+        <w:t>A: “</w:t>
+      </w:r>
+      <w:r>
+        <w:rPr>
+          <w:rFonts w:hint="default" w:ascii="Calibri" w:hAnsi="Calibri" w:eastAsia="宋体" w:cs="Calibri"/>
+          <w:b/>
+          <w:bCs w:val="0"/>
+          <w:color w:val="0000FF"/>
+          <w:kern w:val="2"/>
+          <w:sz w:val="24"/>
+          <w:szCs w:val="24"/>
+          <w:lang w:val="en-US" w:eastAsia="zh-CN"/>
+        </w:rPr>
+        <w:t>”</w:t>
+      </w:r>
+    </w:p>
+    <w:p>
+      <w:pPr>
+        <w:keepNext w:val="0"/>
+        <w:keepLines w:val="0"/>
+        <w:widowControl/>
+        <w:suppressLineNumbers w:val="0"/>
+        <w:jc w:val="left"/>
+        <w:rPr>
+          <w:rStyle w:val="15"/>
+          <w:rFonts w:hint="default" w:ascii="Calibri" w:hAnsi="Calibri" w:eastAsia="宋体" w:cs="Calibri"/>
+          <w:i/>
+          <w:iCs/>
+          <w:sz w:val="24"/>
+          <w:szCs w:val="24"/>
+        </w:rPr>
+      </w:pPr>
+      <w:r>
+        <w:rPr>
+          <w:rStyle w:val="15"/>
+          <w:rFonts w:hint="eastAsia" w:ascii="Calibri" w:hAnsi="Calibri" w:eastAsia="宋体" w:cs="Calibri"/>
+          <w:i/>
+          <w:iCs/>
+          <w:sz w:val="24"/>
+          <w:szCs w:val="24"/>
+          <w:lang w:val="en-US" w:eastAsia="zh-CN"/>
+        </w:rPr>
+        <w:t>Whitepaper Section x(n) n()</w:t>
+      </w:r>
+    </w:p>
+    <w:p>
+      <w:pPr>
+        <w:keepNext w:val="0"/>
+        <w:keepLines w:val="0"/>
+        <w:widowControl/>
+        <w:suppressLineNumbers w:val="0"/>
+        <w:jc w:val="left"/>
+        <w:rPr>
+          <w:rStyle w:val="15"/>
+          <w:rFonts w:hint="default" w:ascii="Calibri" w:hAnsi="Calibri" w:eastAsia="宋体" w:cs="Calibri"/>
+          <w:i/>
+          <w:iCs/>
+          <w:sz w:val="24"/>
+          <w:szCs w:val="24"/>
+          <w:lang w:val="en-US" w:eastAsia="zh-CN"/>
+        </w:rPr>
+      </w:pPr>
+      <w:r>
+        <w:rPr>
+          <w:rStyle w:val="15"/>
+          <w:rFonts w:hint="eastAsia" w:ascii="Calibri" w:hAnsi="Calibri" w:eastAsia="宋体" w:cs="Calibri"/>
+          <w:i/>
+          <w:iCs/>
+          <w:sz w:val="24"/>
+          <w:szCs w:val="24"/>
+          <w:lang w:val="en-US" w:eastAsia="zh-CN"/>
+        </w:rPr>
+        <w:t>Visual Dividends Section n ()</w:t>
+      </w:r>
     </w:p>
     <w:p>
       <w:pPr>
@@ -11134,8 +11522,13 @@
         <w:keepNext w:val="0"/>
         <w:keepLines w:val="0"/>
         <w:widowControl/>
+        <w:numPr>
+          <w:ilvl w:val="0"/>
+          <w:numId w:val="2"/>
+        </w:numPr>
         <w:suppressLineNumbers w:val="0"/>
         <w:spacing w:before="0" w:beforeAutospacing="0" w:after="0" w:afterAutospacing="0"/>
+        <w:ind w:left="425" w:leftChars="0" w:hanging="425" w:firstLineChars="0"/>
         <w:jc w:val="center"/>
         <w:rPr>
           <w:rFonts w:hint="eastAsia" w:ascii="Calibri" w:hAnsi="Calibri" w:cs="Calibri"/>
@@ -11146,17 +11539,6 @@
           <w:lang w:val="en-US" w:eastAsia="zh-CN"/>
         </w:rPr>
       </w:pPr>
-      <w:r>
-        <w:rPr>
-          <w:rFonts w:hint="eastAsia" w:ascii="Calibri" w:hAnsi="Calibri" w:cs="Calibri"/>
-          <w:b/>
-          <w:bCs/>
-          <w:sz w:val="24"/>
-          <w:szCs w:val="24"/>
-          <w:lang w:val="en-US" w:eastAsia="zh-CN"/>
-        </w:rPr>
-        <w:t>x.</w:t>
-      </w:r>
     </w:p>
     <w:p>
       <w:pPr>
@@ -11353,8 +11735,13 @@
         <w:keepNext w:val="0"/>
         <w:keepLines w:val="0"/>
         <w:widowControl/>
+        <w:numPr>
+          <w:ilvl w:val="0"/>
+          <w:numId w:val="2"/>
+        </w:numPr>
         <w:suppressLineNumbers w:val="0"/>
         <w:spacing w:before="0" w:beforeAutospacing="0" w:after="0" w:afterAutospacing="0"/>
+        <w:ind w:left="425" w:leftChars="0" w:hanging="425" w:firstLineChars="0"/>
         <w:jc w:val="center"/>
         <w:rPr>
           <w:rFonts w:hint="eastAsia" w:ascii="Calibri" w:hAnsi="Calibri" w:cs="Calibri"/>
@@ -11365,17 +11752,6 @@
           <w:lang w:val="en-US" w:eastAsia="zh-CN"/>
         </w:rPr>
       </w:pPr>
-      <w:r>
-        <w:rPr>
-          <w:rFonts w:hint="eastAsia" w:ascii="Calibri" w:hAnsi="Calibri" w:cs="Calibri"/>
-          <w:b/>
-          <w:bCs/>
-          <w:sz w:val="24"/>
-          <w:szCs w:val="24"/>
-          <w:lang w:val="en-US" w:eastAsia="zh-CN"/>
-        </w:rPr>
-        <w:t>x.</w:t>
-      </w:r>
     </w:p>
     <w:p>
       <w:pPr>
@@ -11572,8 +11948,13 @@
         <w:keepNext w:val="0"/>
         <w:keepLines w:val="0"/>
         <w:widowControl/>
+        <w:numPr>
+          <w:ilvl w:val="0"/>
+          <w:numId w:val="2"/>
+        </w:numPr>
         <w:suppressLineNumbers w:val="0"/>
         <w:spacing w:before="0" w:beforeAutospacing="0" w:after="0" w:afterAutospacing="0"/>
+        <w:ind w:left="425" w:leftChars="0" w:hanging="425" w:firstLineChars="0"/>
         <w:jc w:val="center"/>
         <w:rPr>
           <w:rFonts w:hint="eastAsia" w:ascii="Calibri" w:hAnsi="Calibri" w:cs="Calibri"/>
@@ -11584,17 +11965,6 @@
           <w:lang w:val="en-US" w:eastAsia="zh-CN"/>
         </w:rPr>
       </w:pPr>
-      <w:r>
-        <w:rPr>
-          <w:rFonts w:hint="eastAsia" w:ascii="Calibri" w:hAnsi="Calibri" w:cs="Calibri"/>
-          <w:b/>
-          <w:bCs/>
-          <w:sz w:val="24"/>
-          <w:szCs w:val="24"/>
-          <w:lang w:val="en-US" w:eastAsia="zh-CN"/>
-        </w:rPr>
-        <w:t>x.</w:t>
-      </w:r>
     </w:p>
     <w:p>
       <w:pPr>
@@ -11780,8 +12150,13 @@
         <w:keepNext w:val="0"/>
         <w:keepLines w:val="0"/>
         <w:widowControl/>
+        <w:numPr>
+          <w:ilvl w:val="0"/>
+          <w:numId w:val="2"/>
+        </w:numPr>
         <w:suppressLineNumbers w:val="0"/>
         <w:spacing w:before="0" w:beforeAutospacing="0" w:after="0" w:afterAutospacing="0"/>
+        <w:ind w:left="425" w:leftChars="0" w:hanging="425" w:firstLineChars="0"/>
         <w:jc w:val="center"/>
         <w:rPr>
           <w:rFonts w:hint="eastAsia" w:ascii="Calibri" w:hAnsi="Calibri" w:cs="Calibri"/>
@@ -11792,17 +12167,6 @@
           <w:lang w:val="en-US" w:eastAsia="zh-CN"/>
         </w:rPr>
       </w:pPr>
-      <w:r>
-        <w:rPr>
-          <w:rFonts w:hint="eastAsia" w:ascii="Calibri" w:hAnsi="Calibri" w:cs="Calibri"/>
-          <w:b/>
-          <w:bCs/>
-          <w:sz w:val="24"/>
-          <w:szCs w:val="24"/>
-          <w:lang w:val="en-US" w:eastAsia="zh-CN"/>
-        </w:rPr>
-        <w:t>x.</w:t>
-      </w:r>
     </w:p>
     <w:p>
       <w:pPr>
@@ -11999,8 +12363,13 @@
         <w:keepNext w:val="0"/>
         <w:keepLines w:val="0"/>
         <w:widowControl/>
+        <w:numPr>
+          <w:ilvl w:val="0"/>
+          <w:numId w:val="2"/>
+        </w:numPr>
         <w:suppressLineNumbers w:val="0"/>
         <w:spacing w:before="0" w:beforeAutospacing="0" w:after="0" w:afterAutospacing="0"/>
+        <w:ind w:left="425" w:leftChars="0" w:hanging="425" w:firstLineChars="0"/>
         <w:jc w:val="center"/>
         <w:rPr>
           <w:rFonts w:hint="eastAsia" w:ascii="Calibri" w:hAnsi="Calibri" w:cs="Calibri"/>
@@ -12011,17 +12380,6 @@
           <w:lang w:val="en-US" w:eastAsia="zh-CN"/>
         </w:rPr>
       </w:pPr>
-      <w:r>
-        <w:rPr>
-          <w:rFonts w:hint="eastAsia" w:ascii="Calibri" w:hAnsi="Calibri" w:cs="Calibri"/>
-          <w:b/>
-          <w:bCs/>
-          <w:sz w:val="24"/>
-          <w:szCs w:val="24"/>
-          <w:lang w:val="en-US" w:eastAsia="zh-CN"/>
-        </w:rPr>
-        <w:t>x.</w:t>
-      </w:r>
     </w:p>
     <w:p>
       <w:pPr>
@@ -12218,8 +12576,13 @@
         <w:keepNext w:val="0"/>
         <w:keepLines w:val="0"/>
         <w:widowControl/>
+        <w:numPr>
+          <w:ilvl w:val="0"/>
+          <w:numId w:val="2"/>
+        </w:numPr>
         <w:suppressLineNumbers w:val="0"/>
         <w:spacing w:before="0" w:beforeAutospacing="0" w:after="0" w:afterAutospacing="0"/>
+        <w:ind w:left="425" w:leftChars="0" w:hanging="425" w:firstLineChars="0"/>
         <w:jc w:val="center"/>
         <w:rPr>
           <w:rFonts w:hint="eastAsia" w:ascii="Calibri" w:hAnsi="Calibri" w:cs="Calibri"/>
@@ -12230,7 +12593,175 @@
           <w:lang w:val="en-US" w:eastAsia="zh-CN"/>
         </w:rPr>
       </w:pPr>
-      <w:r>
+    </w:p>
+    <w:p>
+      <w:pPr>
+        <w:keepNext w:val="0"/>
+        <w:keepLines w:val="0"/>
+        <w:widowControl/>
+        <w:suppressLineNumbers w:val="0"/>
+        <w:spacing w:line="150" w:lineRule="atLeast"/>
+        <w:jc w:val="left"/>
+        <w:rPr>
+          <w:rFonts w:hint="eastAsia" w:ascii="Calibri" w:hAnsi="Calibri" w:eastAsia="宋体" w:cs="Calibri"/>
+          <w:b/>
+          <w:bCs/>
+          <w:color w:val="FF0000"/>
+          <w:kern w:val="2"/>
+          <w:sz w:val="24"/>
+          <w:szCs w:val="24"/>
+          <w:lang w:val="en-US" w:eastAsia="zh-CN"/>
+        </w:rPr>
+      </w:pPr>
+      <w:r>
+        <w:rPr>
+          <w:rFonts w:hint="default" w:ascii="Calibri" w:hAnsi="Calibri" w:eastAsia="宋体" w:cs="Calibri"/>
+          <w:b/>
+          <w:bCs/>
+          <w:color w:val="FF0000"/>
+          <w:kern w:val="2"/>
+          <w:sz w:val="24"/>
+          <w:szCs w:val="24"/>
+        </w:rPr>
+        <w:t>Q: “</w:t>
+      </w:r>
+      <w:r>
+        <w:rPr>
+          <w:rFonts w:hint="default" w:ascii="Calibri" w:hAnsi="Calibri" w:eastAsia="宋体" w:cs="Calibri"/>
+          <w:b/>
+          <w:bCs/>
+          <w:color w:val="FF0000"/>
+          <w:kern w:val="2"/>
+          <w:sz w:val="24"/>
+          <w:szCs w:val="24"/>
+          <w:lang w:val="en-US" w:eastAsia="zh-CN"/>
+        </w:rPr>
+        <w:t>”</w:t>
+      </w:r>
+    </w:p>
+    <w:p>
+      <w:pPr>
+        <w:pStyle w:val="12"/>
+        <w:keepNext w:val="0"/>
+        <w:keepLines w:val="0"/>
+        <w:widowControl/>
+        <w:suppressLineNumbers w:val="0"/>
+        <w:spacing w:line="150" w:lineRule="atLeast"/>
+        <w:rPr>
+          <w:rFonts w:hint="default" w:ascii="Calibri" w:hAnsi="Calibri" w:eastAsia="宋体" w:cs="Calibri"/>
+          <w:b/>
+          <w:bCs w:val="0"/>
+          <w:color w:val="0000FF"/>
+          <w:kern w:val="2"/>
+          <w:sz w:val="24"/>
+          <w:szCs w:val="24"/>
+          <w:lang w:val="en-US" w:eastAsia="zh-CN"/>
+        </w:rPr>
+      </w:pPr>
+      <w:r>
+        <w:rPr>
+          <w:rFonts w:hint="default" w:ascii="Calibri" w:hAnsi="Calibri" w:eastAsia="宋体" w:cs="Calibri"/>
+          <w:b/>
+          <w:bCs w:val="0"/>
+          <w:color w:val="0000FF"/>
+          <w:kern w:val="2"/>
+          <w:sz w:val="24"/>
+          <w:szCs w:val="24"/>
+        </w:rPr>
+        <w:t>A: “</w:t>
+      </w:r>
+      <w:r>
+        <w:rPr>
+          <w:rFonts w:hint="default" w:ascii="Calibri" w:hAnsi="Calibri" w:eastAsia="宋体" w:cs="Calibri"/>
+          <w:b/>
+          <w:bCs w:val="0"/>
+          <w:color w:val="0000FF"/>
+          <w:kern w:val="2"/>
+          <w:sz w:val="24"/>
+          <w:szCs w:val="24"/>
+          <w:lang w:val="en-US" w:eastAsia="zh-CN"/>
+        </w:rPr>
+        <w:t>”</w:t>
+      </w:r>
+    </w:p>
+    <w:p>
+      <w:pPr>
+        <w:keepNext w:val="0"/>
+        <w:keepLines w:val="0"/>
+        <w:widowControl/>
+        <w:suppressLineNumbers w:val="0"/>
+        <w:jc w:val="left"/>
+        <w:rPr>
+          <w:rStyle w:val="15"/>
+          <w:rFonts w:hint="default" w:ascii="Calibri" w:hAnsi="Calibri" w:eastAsia="宋体" w:cs="Calibri"/>
+          <w:i/>
+          <w:iCs/>
+          <w:sz w:val="24"/>
+          <w:szCs w:val="24"/>
+        </w:rPr>
+      </w:pPr>
+      <w:r>
+        <w:rPr>
+          <w:rStyle w:val="15"/>
+          <w:rFonts w:hint="eastAsia" w:ascii="Calibri" w:hAnsi="Calibri" w:eastAsia="宋体" w:cs="Calibri"/>
+          <w:i/>
+          <w:iCs/>
+          <w:sz w:val="24"/>
+          <w:szCs w:val="24"/>
+          <w:lang w:val="en-US" w:eastAsia="zh-CN"/>
+        </w:rPr>
+        <w:t>Whitepaper Section x(n) n()</w:t>
+      </w:r>
+    </w:p>
+    <w:p>
+      <w:pPr>
+        <w:keepNext w:val="0"/>
+        <w:keepLines w:val="0"/>
+        <w:widowControl/>
+        <w:suppressLineNumbers w:val="0"/>
+        <w:jc w:val="left"/>
+        <w:rPr>
+          <w:rStyle w:val="15"/>
+          <w:rFonts w:hint="default" w:ascii="Calibri" w:hAnsi="Calibri" w:eastAsia="宋体" w:cs="Calibri"/>
+          <w:i/>
+          <w:iCs/>
+          <w:sz w:val="24"/>
+          <w:szCs w:val="24"/>
+          <w:lang w:val="en-US" w:eastAsia="zh-CN"/>
+        </w:rPr>
+      </w:pPr>
+      <w:r>
+        <w:rPr>
+          <w:rStyle w:val="15"/>
+          <w:rFonts w:hint="eastAsia" w:ascii="Calibri" w:hAnsi="Calibri" w:eastAsia="宋体" w:cs="Calibri"/>
+          <w:i/>
+          <w:iCs/>
+          <w:sz w:val="24"/>
+          <w:szCs w:val="24"/>
+          <w:lang w:val="en-US" w:eastAsia="zh-CN"/>
+        </w:rPr>
+        <w:t>Visual Dividends Section n ()</w:t>
+      </w:r>
+    </w:p>
+    <w:p>
+      <w:pPr>
+        <w:pStyle w:val="12"/>
+        <w:keepNext w:val="0"/>
+        <w:keepLines w:val="0"/>
+        <w:pageBreakBefore w:val="0"/>
+        <w:widowControl/>
+        <w:suppressLineNumbers w:val="0"/>
+        <w:kinsoku/>
+        <w:wordWrap/>
+        <w:overflowPunct/>
+        <w:topLinePunct w:val="0"/>
+        <w:autoSpaceDE/>
+        <w:autoSpaceDN/>
+        <w:bidi w:val="0"/>
+        <w:adjustRightInd/>
+        <w:snapToGrid/>
+        <w:spacing w:before="315" w:beforeLines="100" w:beforeAutospacing="0" w:after="0" w:afterAutospacing="0" w:line="260" w:lineRule="auto"/>
+        <w:textAlignment w:val="auto"/>
         <w:rPr>
           <w:rFonts w:hint="eastAsia" w:ascii="Calibri" w:hAnsi="Calibri" w:cs="Calibri"/>
           <w:b/>
@@ -12239,8 +12770,42 @@
           <w:szCs w:val="24"/>
           <w:lang w:val="en-US" w:eastAsia="zh-CN"/>
         </w:rPr>
-        <w:t>x.</w:t>
-      </w:r>
+      </w:pPr>
+      <w:r>
+        <w:rPr>
+          <w:rFonts w:hint="eastAsia" w:ascii="Calibri" w:hAnsi="Calibri" w:cs="Calibri"/>
+          <w:b/>
+          <w:bCs/>
+          <w:sz w:val="24"/>
+          <w:szCs w:val="24"/>
+          <w:lang w:eastAsia="zh-CN"/>
+        </w:rPr>
+        <w:t>————————————————————————————————</w:t>
+      </w:r>
+    </w:p>
+    <w:p>
+      <w:pPr>
+        <w:pStyle w:val="12"/>
+        <w:keepNext w:val="0"/>
+        <w:keepLines w:val="0"/>
+        <w:widowControl/>
+        <w:numPr>
+          <w:ilvl w:val="0"/>
+          <w:numId w:val="2"/>
+        </w:numPr>
+        <w:suppressLineNumbers w:val="0"/>
+        <w:spacing w:before="0" w:beforeAutospacing="0" w:after="0" w:afterAutospacing="0"/>
+        <w:ind w:left="425" w:leftChars="0" w:hanging="425" w:firstLineChars="0"/>
+        <w:jc w:val="center"/>
+        <w:rPr>
+          <w:rFonts w:hint="eastAsia" w:ascii="Calibri" w:hAnsi="Calibri" w:cs="Calibri"/>
+          <w:b/>
+          <w:bCs/>
+          <w:sz w:val="24"/>
+          <w:szCs w:val="24"/>
+          <w:lang w:val="en-US" w:eastAsia="zh-CN"/>
+        </w:rPr>
+      </w:pPr>
     </w:p>
     <w:p>
       <w:pPr>
@@ -12661,8 +13226,17 @@
         <w:ind w:left="720" w:hanging="360"/>
       </w:pPr>
       <w:rPr>
-        <w:rFonts w:ascii="Symbol" w:hAnsi="Symbol" w:cs="Symbol"/>
-        <w:sz w:val="20"/>
+        <w:rFonts w:hint="default" w:ascii="Calibri" w:hAnsi="Calibri" w:cs="Calibri"/>
+        <w:b/>
+        <w:bCs/>
+        <w:color w:val="000000" w:themeColor="text1"/>
+        <w:sz w:val="24"/>
+        <w:szCs w:val="24"/>
+        <w14:textFill>
+          <w14:solidFill>
+            <w14:schemeClr w14:val="tx1"/>
+          </w14:solidFill>
+        </w14:textFill>
       </w:rPr>
     </w:lvl>
     <w:lvl w:ilvl="1" w:tentative="0">
@@ -12960,16 +13534,41 @@
       </w:rPr>
     </w:lvl>
   </w:abstractNum>
+  <w:abstractNum w:abstractNumId="4">
+    <w:nsid w:val="7B2474A5"/>
+    <w:multiLevelType w:val="singleLevel"/>
+    <w:tmpl w:val="7B2474A5"/>
+    <w:lvl w:ilvl="0" w:tentative="0">
+      <w:start w:val="1"/>
+      <w:numFmt w:val="decimal"/>
+      <w:lvlText w:val="%1."/>
+      <w:lvlJc w:val="left"/>
+      <w:pPr>
+        <w:ind w:left="425" w:hanging="425"/>
+      </w:pPr>
+      <w:rPr>
+        <w:rFonts w:hint="default"/>
+        <w:b/>
+        <w:bCs/>
+        <w:color w:val="auto"/>
+        <w:sz w:val="24"/>
+        <w:szCs w:val="24"/>
+      </w:rPr>
+    </w:lvl>
+  </w:abstractNum>
   <w:num w:numId="1">
     <w:abstractNumId w:val="0"/>
   </w:num>
   <w:num w:numId="2">
+    <w:abstractNumId w:val="4"/>
+  </w:num>
+  <w:num w:numId="3">
     <w:abstractNumId w:val="1"/>
   </w:num>
-  <w:num w:numId="3">
+  <w:num w:numId="4">
     <w:abstractNumId w:val="2"/>
   </w:num>
-  <w:num w:numId="4">
+  <w:num w:numId="5">
     <w:abstractNumId w:val="3"/>
   </w:num>
 </w:numbering>
@@ -13085,7 +13684,7 @@
     <w:lsdException w:unhideWhenUsed="0" w:uiPriority="0" w:semiHidden="0" w:name="HTML Code"/>
     <w:lsdException w:unhideWhenUsed="0" w:uiPriority="0" w:semiHidden="0" w:name="HTML Definition"/>
     <w:lsdException w:unhideWhenUsed="0" w:uiPriority="0" w:semiHidden="0" w:name="HTML Keyboard"/>
-    <w:lsdException w:unhideWhenUsed="0" w:uiPriority="0" w:semiHidden="0" w:name="HTML Preformatted"/>
+    <w:lsdException w:qFormat="1" w:unhideWhenUsed="0" w:uiPriority="0" w:semiHidden="0" w:name="HTML Preformatted"/>
     <w:lsdException w:unhideWhenUsed="0" w:uiPriority="0" w:semiHidden="0" w:name="HTML Sample"/>
     <w:lsdException w:unhideWhenUsed="0" w:uiPriority="0" w:semiHidden="0" w:name="HTML Typewriter"/>
     <w:lsdException w:unhideWhenUsed="0" w:uiPriority="0" w:semiHidden="0" w:name="HTML Variable"/>
@@ -13498,6 +14097,7 @@
   <w:style w:type="paragraph" w:styleId="11">
     <w:name w:val="HTML Preformatted"/>
     <w:basedOn w:val="1"/>
+    <w:qFormat/>
     <w:uiPriority w:val="0"/>
     <w:pPr>
       <w:tabs>

</xml_diff>